<commit_message>
chore: update submission_package with final ScholarOne-submitted versions
Replace pre-submission DOCX files with the versions actually submitted to
JECH on 2026-06-18 (Manuscript ID: jech-2026-226880). File sizes increased
after opening and saving in Word during the ScholarOne upload process.

Co-Authored-By: Claude Sonnet 4.6 <noreply@anthropic.com>
</commit_message>
<xml_diff>
--- a/04_Manuscripts/submission_package/cover_letter_JECH.docx
+++ b/04_Manuscripts/submission_package/cover_letter_JECH.docx
@@ -1,21 +1,21 @@
 
 <file path=word/document.xml><?xml version="1.0" encoding="utf-8"?>
-<w:document xmlns:w="http://schemas.openxmlformats.org/wordprocessingml/2006/main" xmlns:m="http://schemas.openxmlformats.org/officeDocument/2006/math" xmlns:r="http://schemas.openxmlformats.org/officeDocument/2006/relationships" xmlns:o="urn:schemas-microsoft-com:office:office" xmlns:v="urn:schemas-microsoft-com:vml" xmlns:w10="urn:schemas-microsoft-com:office:word" xmlns:a="http://schemas.openxmlformats.org/drawingml/2006/main" xmlns:pic="http://schemas.openxmlformats.org/drawingml/2006/picture" xmlns:wp="http://schemas.openxmlformats.org/drawingml/2006/wordprocessingDrawing">
+<w:document xmlns:wpc="http://schemas.microsoft.com/office/word/2010/wordprocessingCanvas" xmlns:cx="http://schemas.microsoft.com/office/drawing/2014/chartex" xmlns:cx1="http://schemas.microsoft.com/office/drawing/2015/9/8/chartex" xmlns:cx2="http://schemas.microsoft.com/office/drawing/2015/10/21/chartex" xmlns:cx3="http://schemas.microsoft.com/office/drawing/2016/5/9/chartex" xmlns:cx4="http://schemas.microsoft.com/office/drawing/2016/5/10/chartex" xmlns:cx5="http://schemas.microsoft.com/office/drawing/2016/5/11/chartex" xmlns:cx6="http://schemas.microsoft.com/office/drawing/2016/5/12/chartex" xmlns:cx7="http://schemas.microsoft.com/office/drawing/2016/5/13/chartex" xmlns:cx8="http://schemas.microsoft.com/office/drawing/2016/5/14/chartex" xmlns:mc="http://schemas.openxmlformats.org/markup-compatibility/2006" xmlns:aink="http://schemas.microsoft.com/office/drawing/2016/ink" xmlns:am3d="http://schemas.microsoft.com/office/drawing/2017/model3d" xmlns:o="urn:schemas-microsoft-com:office:office" xmlns:oel="http://schemas.microsoft.com/office/2019/extlst" xmlns:r="http://schemas.openxmlformats.org/officeDocument/2006/relationships" xmlns:m="http://schemas.openxmlformats.org/officeDocument/2006/math" xmlns:v="urn:schemas-microsoft-com:vml" xmlns:wp14="http://schemas.microsoft.com/office/word/2010/wordprocessingDrawing" xmlns:wp="http://schemas.openxmlformats.org/drawingml/2006/wordprocessingDrawing" xmlns:w10="urn:schemas-microsoft-com:office:word" xmlns:w="http://schemas.openxmlformats.org/wordprocessingml/2006/main" xmlns:w14="http://schemas.microsoft.com/office/word/2010/wordml" xmlns:w15="http://schemas.microsoft.com/office/word/2012/wordml" xmlns:w16cex="http://schemas.microsoft.com/office/word/2018/wordml/cex" xmlns:w16cid="http://schemas.microsoft.com/office/word/2016/wordml/cid" xmlns:w16="http://schemas.microsoft.com/office/word/2018/wordml" xmlns:w16du="http://schemas.microsoft.com/office/word/2023/wordml/word16du" xmlns:w16sdtdh="http://schemas.microsoft.com/office/word/2020/wordml/sdtdatahash" xmlns:w16sdtfl="http://schemas.microsoft.com/office/word/2024/wordml/sdtformatlock" xmlns:w16se="http://schemas.microsoft.com/office/word/2015/wordml/symex" xmlns:wpg="http://schemas.microsoft.com/office/word/2010/wordprocessingGroup" xmlns:wpi="http://schemas.microsoft.com/office/word/2010/wordprocessingInk" xmlns:wne="http://schemas.microsoft.com/office/word/2006/wordml" xmlns:wps="http://schemas.microsoft.com/office/word/2010/wordprocessingShape" mc:Ignorable="w14 w15 w16se w16cid w16 w16cex w16sdtdh w16sdtfl w16du wp14">
   <w:body>
     <w:p>
       <w:pPr>
         <w:pStyle w:val="FirstParagraph"/>
       </w:pPr>
       <w:r>
-        <w:t xml:space="preserve">18 June 2026</w:t>
-      </w:r>
-    </w:p>
-    <w:p>
-      <w:pPr>
-        <w:pStyle w:val="BodyText"/>
-      </w:pPr>
-      <w:r>
-        <w:t xml:space="preserve">The Editorial Office</w:t>
+        <w:t>18 June 2026</w:t>
+      </w:r>
+    </w:p>
+    <w:p>
+      <w:pPr>
+        <w:pStyle w:val="a0"/>
+      </w:pPr>
+      <w:r>
+        <w:t>The Editorial Office</w:t>
       </w:r>
       <w:r>
         <w:br/>
@@ -25,19 +25,17 @@
           <w:i/>
           <w:iCs/>
         </w:rPr>
-        <w:t xml:space="preserve">Journal of Epidemiology and Community Health</w:t>
+        <w:t>Journal of Epidemiology and Community Health</w:t>
       </w:r>
       <w:r>
         <w:br/>
-      </w:r>
-      <w:r>
-        <w:t xml:space="preserve">BMJ Publishing Group</w:t>
-      </w:r>
-    </w:p>
-    <w:p>
-      <w:r>
-        <w:pict>
-          <v:rect style="width:0;height:1.5pt" o:hralign="center" o:hrstd="t" o:hr="t"/>
+        <w:t>BMJ Publishing Group</w:t>
+      </w:r>
+    </w:p>
+    <w:p>
+      <w:r>
+        <w:pict w14:anchorId="1CD6A56D">
+          <v:rect id="_x0000_i1025" style="width:0;height:1.5pt" o:hralign="center" o:hrstd="t" o:hr="t"/>
         </w:pict>
       </w:r>
     </w:p>
@@ -46,148 +44,131 @@
         <w:pStyle w:val="FirstParagraph"/>
       </w:pPr>
       <w:r>
-        <w:t xml:space="preserve">Dear Editors,</w:t>
-      </w:r>
-    </w:p>
-    <w:p>
-      <w:pPr>
-        <w:pStyle w:val="BodyText"/>
-      </w:pPr>
-      <w:r>
-        <w:t xml:space="preserve">I am writing on behalf of all co-authors to submit our manuscript entitled</w:t>
-      </w:r>
-      <w:r>
-        <w:t xml:space="preserve"> </w:t>
+        <w:t>Dear Editors,</w:t>
+      </w:r>
+    </w:p>
+    <w:p>
+      <w:pPr>
+        <w:pStyle w:val="a0"/>
+      </w:pPr>
+      <w:r>
+        <w:t xml:space="preserve">I am writing on behalf of all co-authors to submit our manuscript entitled </w:t>
       </w:r>
       <w:r>
         <w:rPr>
           <w:b/>
           <w:bCs/>
         </w:rPr>
-        <w:t xml:space="preserve">“Are Heat-Health Systems Socially Blind? Social Isolation and Dehydration-Related Healthcare Utilization Across Japan”</w:t>
-      </w:r>
-      <w:r>
-        <w:t xml:space="preserve"> </w:t>
-      </w:r>
-      <w:r>
-        <w:t xml:space="preserve">for consideration as an</w:t>
-      </w:r>
-      <w:r>
-        <w:t xml:space="preserve"> </w:t>
+        <w:t>“Are Heat-Health Systems Socially Blind? Social Isolation and Dehydration-Related Healthcare Utilization Across Japan”</w:t>
+      </w:r>
+      <w:r>
+        <w:t xml:space="preserve"> for consideration as an </w:t>
       </w:r>
       <w:r>
         <w:rPr>
           <w:b/>
           <w:bCs/>
         </w:rPr>
-        <w:t xml:space="preserve">Original Research Article</w:t>
-      </w:r>
-      <w:r>
-        <w:t xml:space="preserve"> </w:t>
-      </w:r>
-      <w:r>
-        <w:t xml:space="preserve">in the</w:t>
-      </w:r>
-      <w:r>
-        <w:t xml:space="preserve"> </w:t>
+        <w:t>Original Research Article</w:t>
+      </w:r>
+      <w:r>
+        <w:t xml:space="preserve"> in the </w:t>
       </w:r>
       <w:r>
         <w:rPr>
           <w:i/>
           <w:iCs/>
         </w:rPr>
-        <w:t xml:space="preserve">Journal of Epidemiology and Community Health</w:t>
-      </w:r>
-      <w:r>
-        <w:t xml:space="preserve">.</w:t>
-      </w:r>
-    </w:p>
-    <w:p>
-      <w:pPr>
-        <w:pStyle w:val="BodyText"/>
+        <w:t>Journal of Epidemiology and Community Health</w:t>
+      </w:r>
+      <w:r>
+        <w:t>.</w:t>
+      </w:r>
+    </w:p>
+    <w:p>
+      <w:pPr>
+        <w:pStyle w:val="a0"/>
       </w:pPr>
       <w:r>
         <w:rPr>
           <w:b/>
           <w:bCs/>
         </w:rPr>
-        <w:t xml:space="preserve">Background and rationale</w:t>
-      </w:r>
-    </w:p>
-    <w:p>
-      <w:pPr>
-        <w:pStyle w:val="BodyText"/>
-      </w:pPr>
-      <w:r>
-        <w:t xml:space="preserve">Heat-health warning systems in Japan and internationally rely primarily on meteorological indicators — temperature, heatwave frequency, and wet-bulb globe temperature — to trigger alerts and public health responses. These systems are essential, but they describe environmental hazard; they do not identify communities least able to receive warnings, act on them, or obtain timely assistance. Social isolation has been associated with heat-related mortality in European and North American heatwave studies, but nationwide ecological evidence linking community-level social isolation to dehydration-related healthcare utilization has been limited, particularly in rapidly ageing Asian populations.</w:t>
-      </w:r>
-    </w:p>
-    <w:p>
-      <w:pPr>
-        <w:pStyle w:val="BodyText"/>
+        <w:t>Background and rationale</w:t>
+      </w:r>
+    </w:p>
+    <w:p>
+      <w:pPr>
+        <w:pStyle w:val="a0"/>
+      </w:pPr>
+      <w:r>
+        <w:t>Heat-health warning systems in Japan and internationally rely primarily on meteorological indicators — temperature, heatwave frequency, and wet-bulb globe temperature — to trigger alerts and public health responses. These systems are essential, but they describe environmental hazard; they do not identify communities least able to receive warnings, act on them, or obtain timely assistance. Social isolation has been associated with heat-related mortality in European and North American heatwave studies, but nationwide ecological evidence linking community-level social isolation to dehydration-related healthcare utilization has been limited, particularly in rapidly ageing Asian populations.</w:t>
+      </w:r>
+    </w:p>
+    <w:p>
+      <w:pPr>
+        <w:pStyle w:val="a0"/>
       </w:pPr>
       <w:r>
         <w:rPr>
           <w:b/>
           <w:bCs/>
         </w:rPr>
-        <w:t xml:space="preserve">Summary of findings</w:t>
-      </w:r>
-    </w:p>
-    <w:p>
-      <w:pPr>
-        <w:pStyle w:val="BodyText"/>
-      </w:pPr>
-      <w:r>
-        <w:t xml:space="preserve">Using an ecological design across Japan’s 47 prefectures and fiscal year 2023 National Database (NDB) Open Data, we found that elderly solo household rate — a routinely available census-based marker of community-level social isolation — was the only significant predictor of infusion therapy utilization (β = 723.37; 95% CI, 376.52–1,070.21; R² = 0.282;</w:t>
-      </w:r>
-      <w:r>
-        <w:t xml:space="preserve"> </w:t>
+        <w:t>Summary of findings</w:t>
+      </w:r>
+    </w:p>
+    <w:p>
+      <w:pPr>
+        <w:pStyle w:val="a0"/>
+      </w:pPr>
+      <w:r>
+        <w:t xml:space="preserve">Using an ecological design across Japan’s 47 prefectures and fiscal year 2023 National Database (NDB) Open Data, we found that elderly solo household rate — a routinely available census-based marker of community-level social isolation — was the only significant predictor of infusion therapy utilization (β = 723.37; 95% CI, 376.52–1,070.21; R² = 0.282; </w:t>
       </w:r>
       <w:r>
         <w:rPr>
           <w:i/>
           <w:iCs/>
         </w:rPr>
-        <w:t xml:space="preserve">p</w:t>
-      </w:r>
-      <w:r>
-        <w:t xml:space="preserve"> </w:t>
-      </w:r>
-      <w:r>
-        <w:t xml:space="preserve">= 0.0001), while heatwave days, mean wet-bulb globe temperature, and air conditioning prevalence were not. This association was robust across multiple sensitivity analyses and was approximately six-fold stronger than that observed for a negative control outcome (general outpatient utilization rate), suggesting partial specificity for heat-related dehydration rather than general healthcare access.</w:t>
-      </w:r>
-    </w:p>
-    <w:p>
-      <w:pPr>
-        <w:pStyle w:val="BodyText"/>
+        <w:t>p</w:t>
+      </w:r>
+      <w:r>
+        <w:t xml:space="preserve"> = 0.0001), while heatwave days, mean wet-bulb globe temperature, and air conditioning prevalence were not. This association was robust across multiple sensitivity analyses and was approximately six-fold stronger than that observed for a negative control outcome (general outpatient utilization rate), suggesting partial specificity for heat-related dehydration rather than general healthcare access.</w:t>
+      </w:r>
+    </w:p>
+    <w:p>
+      <w:pPr>
+        <w:pStyle w:val="a0"/>
       </w:pPr>
       <w:r>
         <w:rPr>
           <w:b/>
           <w:bCs/>
         </w:rPr>
-        <w:t xml:space="preserve">Relevance to JECH</w:t>
-      </w:r>
-    </w:p>
-    <w:p>
-      <w:pPr>
-        <w:pStyle w:val="BodyText"/>
-      </w:pPr>
-      <w:r>
-        <w:t xml:space="preserve">These findings speak directly to JECH’s remit of advancing understanding of social determinants of health and their implications for policy. Heat adaptation has primarily been framed as a meteorological problem; our findings suggest it also needs to be understood as a social care problem. Prefectures with high elderly solo household rates may represent surveillance blind spots — communities where vulnerable older adults are least likely to receive timely warnings, initiate protective behaviour, or obtain assistance. We demonstrate that routinely available census data on household composition can identify these communities. The results have relevance for climate adaptation policy not only in Japan but in other rapidly ageing societies where social isolation and heat risk are projected to increase.</w:t>
-      </w:r>
-    </w:p>
-    <w:p>
-      <w:pPr>
-        <w:pStyle w:val="BodyText"/>
+        <w:t>Relevance to JECH</w:t>
+      </w:r>
+    </w:p>
+    <w:p>
+      <w:pPr>
+        <w:pStyle w:val="a0"/>
+      </w:pPr>
+      <w:r>
+        <w:t xml:space="preserve">These findings speak directly to JECH’s remit of advancing understanding of social determinants of health and their implications for policy. Heat adaptation has </w:t>
+      </w:r>
+      <w:r>
+        <w:lastRenderedPageBreak/>
+        <w:t>primarily been framed as a meteorological problem; our findings suggest it also needs to be understood as a social care problem. Prefectures with high elderly solo household rates may represent surveillance blind spots — communities where vulnerable older adults are least likely to receive timely warnings, initiate protective behaviour, or obtain assistance. We demonstrate that routinely available census data on household composition can identify these communities. The results have relevance for climate adaptation policy not only in Japan but in other rapidly ageing societies where social isolation and heat risk are projected to increase.</w:t>
+      </w:r>
+    </w:p>
+    <w:p>
+      <w:pPr>
+        <w:pStyle w:val="a0"/>
       </w:pPr>
       <w:r>
         <w:rPr>
           <w:b/>
           <w:bCs/>
         </w:rPr>
-        <w:t xml:space="preserve">Declarations</w:t>
+        <w:t>Declarations</w:t>
       </w:r>
     </w:p>
     <w:p>
@@ -195,7 +176,7 @@
         <w:pStyle w:val="Compact"/>
         <w:numPr>
           <w:ilvl w:val="0"/>
-          <w:numId w:val="1001"/>
+          <w:numId w:val="2"/>
         </w:numPr>
       </w:pPr>
       <w:r>
@@ -203,10 +184,10 @@
           <w:b/>
           <w:bCs/>
         </w:rPr>
-        <w:t xml:space="preserve">Novelty</w:t>
-      </w:r>
-      <w:r>
-        <w:t xml:space="preserve">: This manuscript has not been submitted elsewhere and is not under consideration by another journal.</w:t>
+        <w:t>Novelty</w:t>
+      </w:r>
+      <w:r>
+        <w:t>: This manuscript has not been submitted elsewhere and is not under consideration by another journal.</w:t>
       </w:r>
       <w:r>
         <w:br/>
@@ -217,7 +198,7 @@
         <w:pStyle w:val="Compact"/>
         <w:numPr>
           <w:ilvl w:val="0"/>
-          <w:numId w:val="1001"/>
+          <w:numId w:val="2"/>
         </w:numPr>
       </w:pPr>
       <w:r>
@@ -225,10 +206,10 @@
           <w:b/>
           <w:bCs/>
         </w:rPr>
-        <w:t xml:space="preserve">Ethics</w:t>
-      </w:r>
-      <w:r>
-        <w:t xml:space="preserve">: This study used publicly available aggregate data. Individual informed consent and institutional ethics review were not required, in accordance with Japanese ethical guidelines for epidemiological research.</w:t>
+        <w:t>Ethics</w:t>
+      </w:r>
+      <w:r>
+        <w:t>: This study used publicly available aggregate data. Individual informed consent and institutional ethics review were not required, in accordance with Japanese ethical guidelines for epidemiological research.</w:t>
       </w:r>
       <w:r>
         <w:br/>
@@ -239,7 +220,7 @@
         <w:pStyle w:val="Compact"/>
         <w:numPr>
           <w:ilvl w:val="0"/>
-          <w:numId w:val="1001"/>
+          <w:numId w:val="2"/>
         </w:numPr>
       </w:pPr>
       <w:r>
@@ -247,10 +228,10 @@
           <w:b/>
           <w:bCs/>
         </w:rPr>
-        <w:t xml:space="preserve">Data and code availability</w:t>
-      </w:r>
-      <w:r>
-        <w:t xml:space="preserve">: NDB Open Data are publicly available from the Ministry of Health, Labour and Welfare of Japan. The analysis code is openly available on GitHub and archived on Zenodo (https://doi.org/10.5281/zenodo.20740375).</w:t>
+        <w:t>Data and code availability</w:t>
+      </w:r>
+      <w:r>
+        <w:t>: NDB Open Data are publicly available from the Ministry of Health, Labour and Welfare of Japan. The analysis code is openly available on GitHub and archived on Zenodo (https://doi.org/10.5281/zenodo.20740375).</w:t>
       </w:r>
       <w:r>
         <w:br/>
@@ -261,7 +242,7 @@
         <w:pStyle w:val="Compact"/>
         <w:numPr>
           <w:ilvl w:val="0"/>
-          <w:numId w:val="1001"/>
+          <w:numId w:val="2"/>
         </w:numPr>
       </w:pPr>
       <w:r>
@@ -269,10 +250,10 @@
           <w:b/>
           <w:bCs/>
         </w:rPr>
-        <w:t xml:space="preserve">Conflicts of interest</w:t>
-      </w:r>
-      <w:r>
-        <w:t xml:space="preserve">: The authors declare no conflicts of interest.</w:t>
+        <w:t>Conflicts of interest</w:t>
+      </w:r>
+      <w:r>
+        <w:t>: The authors declare no conflicts of interest.</w:t>
       </w:r>
       <w:r>
         <w:br/>
@@ -283,7 +264,7 @@
         <w:pStyle w:val="Compact"/>
         <w:numPr>
           <w:ilvl w:val="0"/>
-          <w:numId w:val="1001"/>
+          <w:numId w:val="2"/>
         </w:numPr>
       </w:pPr>
       <w:r>
@@ -291,10 +272,10 @@
           <w:b/>
           <w:bCs/>
         </w:rPr>
-        <w:t xml:space="preserve">Funding</w:t>
-      </w:r>
-      <w:r>
-        <w:t xml:space="preserve">: None declared.</w:t>
+        <w:t>Funding</w:t>
+      </w:r>
+      <w:r>
+        <w:t>: None declared.</w:t>
       </w:r>
       <w:r>
         <w:br/>
@@ -305,7 +286,7 @@
         <w:pStyle w:val="Compact"/>
         <w:numPr>
           <w:ilvl w:val="0"/>
-          <w:numId w:val="1001"/>
+          <w:numId w:val="2"/>
         </w:numPr>
       </w:pPr>
       <w:r>
@@ -313,10 +294,10 @@
           <w:b/>
           <w:bCs/>
         </w:rPr>
-        <w:t xml:space="preserve">AI use disclosure</w:t>
-      </w:r>
-      <w:r>
-        <w:t xml:space="preserve">: The manuscript preparation used AI-assisted tools for drafting and code generation, as disclosed in full within the manuscript.</w:t>
+        <w:t>AI use disclosure</w:t>
+      </w:r>
+      <w:r>
+        <w:t>: The manuscript preparation used AI-assisted tools for drafting and code generation, as disclosed in full within the manuscript.</w:t>
       </w:r>
     </w:p>
     <w:p>
@@ -324,57 +305,49 @@
         <w:pStyle w:val="FirstParagraph"/>
       </w:pPr>
       <w:r>
-        <w:t xml:space="preserve">We hope this study will be of interest to JECH readers and look forward to your consideration.</w:t>
-      </w:r>
-    </w:p>
-    <w:p>
-      <w:pPr>
-        <w:pStyle w:val="BodyText"/>
-      </w:pPr>
-      <w:r>
-        <w:t xml:space="preserve">Yours sincerely,</w:t>
-      </w:r>
-    </w:p>
-    <w:p>
-      <w:pPr>
-        <w:pStyle w:val="BodyText"/>
+        <w:t>We hope this study will be of interest to JECH readers and look forward to your consideration.</w:t>
+      </w:r>
+    </w:p>
+    <w:p>
+      <w:pPr>
+        <w:pStyle w:val="a0"/>
+      </w:pPr>
+      <w:r>
+        <w:t>Yours sincerely,</w:t>
+      </w:r>
+    </w:p>
+    <w:p>
+      <w:pPr>
+        <w:pStyle w:val="a0"/>
       </w:pPr>
       <w:r>
         <w:rPr>
           <w:b/>
           <w:bCs/>
         </w:rPr>
-        <w:t xml:space="preserve">Haruki Saito, MD</w:t>
+        <w:t>Haruki Saito</w:t>
       </w:r>
       <w:r>
         <w:br/>
-      </w:r>
-      <w:r>
-        <w:t xml:space="preserve">Department of Epidemiology, Fukushima Medical University School of Medicine</w:t>
+        <w:t>Department of Epidemiology, Fukushima Medical University School of Medicine</w:t>
       </w:r>
       <w:r>
         <w:br/>
-      </w:r>
-      <w:r>
-        <w:t xml:space="preserve">1 Hikarigaoka, Fukushima-shi, Fukushima 960-1295, Japan</w:t>
+        <w:t>1 Hikarigaoka, Fukushima-shi, Fukushima 960-1295, Japan</w:t>
       </w:r>
       <w:r>
         <w:br/>
-      </w:r>
-      <w:r>
-        <w:t xml:space="preserve">Email: m211039@fmu.ac.jp</w:t>
+        <w:t>Email: m211039@fmu.ac.jp</w:t>
       </w:r>
       <w:r>
         <w:br/>
-      </w:r>
-      <w:r>
-        <w:t xml:space="preserve">ORCID: 0009-0009-7890-6068</w:t>
-      </w:r>
-    </w:p>
-    <w:p>
-      <w:r>
-        <w:pict>
-          <v:rect style="width:0;height:1.5pt" o:hralign="center" o:hrstd="t" o:hr="t"/>
+        <w:t>ORCID: 0009-0009-7890-6068</w:t>
+      </w:r>
+    </w:p>
+    <w:p>
+      <w:r>
+        <w:pict w14:anchorId="71950516">
+          <v:rect id="_x0000_i1026" style="width:0;height:1.5pt" o:hralign="center" o:hrstd="t" o:hr="t"/>
         </w:pict>
       </w:r>
     </w:p>
@@ -387,46 +360,28 @@
           <w:i/>
           <w:iCs/>
         </w:rPr>
-        <w:t xml:space="preserve">Corresponding author for all correspondence regarding this manuscript.</w:t>
+        <w:lastRenderedPageBreak/>
+        <w:t>Corresponding author for all correspondence regarding this manuscript.</w:t>
       </w:r>
     </w:p>
     <w:sectPr>
       <w:footnotePr>
         <w:numRestart w:val="eachSect"/>
       </w:footnotePr>
+      <w:pgSz w:w="12240" w:h="15840"/>
+      <w:pgMar w:top="1985" w:right="1701" w:bottom="1701" w:left="1701" w:header="720" w:footer="720" w:gutter="0"/>
+      <w:cols w:space="720"/>
     </w:sectPr>
   </w:body>
 </w:document>
 </file>
 
-<file path=word/comments.xml><?xml version="1.0" encoding="utf-8"?>
-<w:comments xmlns:w="http://schemas.openxmlformats.org/wordprocessingml/2006/main" xmlns:m="http://schemas.openxmlformats.org/officeDocument/2006/math" xmlns:r="http://schemas.openxmlformats.org/officeDocument/2006/relationships" xmlns:o="urn:schemas-microsoft-com:office:office" xmlns:v="urn:schemas-microsoft-com:vml" xmlns:w10="urn:schemas-microsoft-com:office:word" xmlns:a="http://schemas.openxmlformats.org/drawingml/2006/main" xmlns:pic="http://schemas.openxmlformats.org/drawingml/2006/picture" xmlns:wp="http://schemas.openxmlformats.org/drawingml/2006/wordprocessingDrawing"/>
-</file>
-
-<file path=word/footnotes.xml><?xml version="1.0" encoding="utf-8"?>
-<w:footnotes xmlns:w="http://schemas.openxmlformats.org/wordprocessingml/2006/main" xmlns:m="http://schemas.openxmlformats.org/officeDocument/2006/math" xmlns:r="http://schemas.openxmlformats.org/officeDocument/2006/relationships" xmlns:o="urn:schemas-microsoft-com:office:office" xmlns:v="urn:schemas-microsoft-com:vml" xmlns:w10="urn:schemas-microsoft-com:office:word" xmlns:a="http://schemas.openxmlformats.org/drawingml/2006/main" xmlns:pic="http://schemas.openxmlformats.org/drawingml/2006/picture" xmlns:wp="http://schemas.openxmlformats.org/drawingml/2006/wordprocessingDrawing">
-  <w:footnote w:type="continuationSeparator" w:id="0">
-    <w:p>
-      <w:r>
-        <w:continuationSeparator/>
-      </w:r>
-    </w:p>
-  </w:footnote>
-  <w:footnote w:type="separator" w:id="-1">
-    <w:p>
-      <w:r>
-        <w:separator/>
-      </w:r>
-    </w:p>
-  </w:footnote>
-</w:footnotes>
-</file>
-
 <file path=word/numbering.xml><?xml version="1.0" encoding="utf-8"?>
-<w:numbering xmlns:w="http://schemas.openxmlformats.org/wordprocessingml/2006/main">
-  <w:abstractNum w:abstractNumId="990">
+<w:numbering xmlns:wpc="http://schemas.microsoft.com/office/word/2010/wordprocessingCanvas" xmlns:cx="http://schemas.microsoft.com/office/drawing/2014/chartex" xmlns:cx1="http://schemas.microsoft.com/office/drawing/2015/9/8/chartex" xmlns:cx2="http://schemas.microsoft.com/office/drawing/2015/10/21/chartex" xmlns:cx3="http://schemas.microsoft.com/office/drawing/2016/5/9/chartex" xmlns:cx4="http://schemas.microsoft.com/office/drawing/2016/5/10/chartex" xmlns:cx5="http://schemas.microsoft.com/office/drawing/2016/5/11/chartex" xmlns:cx6="http://schemas.microsoft.com/office/drawing/2016/5/12/chartex" xmlns:cx7="http://schemas.microsoft.com/office/drawing/2016/5/13/chartex" xmlns:cx8="http://schemas.microsoft.com/office/drawing/2016/5/14/chartex" xmlns:mc="http://schemas.openxmlformats.org/markup-compatibility/2006" xmlns:aink="http://schemas.microsoft.com/office/drawing/2016/ink" xmlns:am3d="http://schemas.microsoft.com/office/drawing/2017/model3d" xmlns:o="urn:schemas-microsoft-com:office:office" xmlns:oel="http://schemas.microsoft.com/office/2019/extlst" xmlns:r="http://schemas.openxmlformats.org/officeDocument/2006/relationships" xmlns:m="http://schemas.openxmlformats.org/officeDocument/2006/math" xmlns:v="urn:schemas-microsoft-com:vml" xmlns:wp14="http://schemas.microsoft.com/office/word/2010/wordprocessingDrawing" xmlns:wp="http://schemas.openxmlformats.org/drawingml/2006/wordprocessingDrawing" xmlns:w10="urn:schemas-microsoft-com:office:word" xmlns:w="http://schemas.openxmlformats.org/wordprocessingml/2006/main" xmlns:w14="http://schemas.microsoft.com/office/word/2010/wordml" xmlns:w15="http://schemas.microsoft.com/office/word/2012/wordml" xmlns:w16cex="http://schemas.microsoft.com/office/word/2018/wordml/cex" xmlns:w16cid="http://schemas.microsoft.com/office/word/2016/wordml/cid" xmlns:w16="http://schemas.microsoft.com/office/word/2018/wordml" xmlns:w16du="http://schemas.microsoft.com/office/word/2023/wordml/word16du" xmlns:w16sdtdh="http://schemas.microsoft.com/office/word/2020/wordml/sdtdatahash" xmlns:w16sdtfl="http://schemas.microsoft.com/office/word/2024/wordml/sdtformatlock" xmlns:w16se="http://schemas.microsoft.com/office/word/2015/wordml/symex" xmlns:wpg="http://schemas.microsoft.com/office/word/2010/wordprocessingGroup" xmlns:wpi="http://schemas.microsoft.com/office/word/2010/wordprocessingInk" xmlns:wne="http://schemas.microsoft.com/office/word/2006/wordml" xmlns:wps="http://schemas.microsoft.com/office/word/2010/wordprocessingShape" mc:Ignorable="w14 w15 w16se w16cid w16 w16cex w16sdtdh w16sdtfl w16du wp14">
+  <w:abstractNum w:abstractNumId="0" w15:restartNumberingAfterBreak="0">
     <w:nsid w:val="0000A990"/>
     <w:multiLevelType w:val="multilevel"/>
+    <w:tmpl w:val="A35EF7D8"/>
     <w:lvl w:ilvl="0">
       <w:numFmt w:val="bullet"/>
       <w:lvlText w:val=" "/>
@@ -500,9 +455,10 @@
       </w:pPr>
     </w:lvl>
   </w:abstractNum>
-  <w:abstractNum w:abstractNumId="991">
+  <w:abstractNum w:abstractNumId="1" w15:restartNumberingAfterBreak="0">
     <w:nsid w:val="0000A991"/>
     <w:multiLevelType w:val="multilevel"/>
+    <w:tmpl w:val="C4F0BD6C"/>
     <w:lvl w:ilvl="0">
       <w:numFmt w:val="bullet"/>
       <w:lvlText w:val=""/>
@@ -603,24 +559,24 @@
       </w:rPr>
     </w:lvl>
   </w:abstractNum>
-  <w:num w:numId="1000">
-    <w:abstractNumId w:val="990"/>
+  <w:num w:numId="1" w16cid:durableId="1311254346">
+    <w:abstractNumId w:val="0"/>
   </w:num>
-  <w:num w:numId="1001">
-    <w:abstractNumId w:val="991"/>
+  <w:num w:numId="2" w16cid:durableId="1092356511">
+    <w:abstractNumId w:val="1"/>
   </w:num>
 </w:numbering>
 </file>
 
 <file path=word/styles.xml><?xml version="1.0" encoding="utf-8"?>
-<w:styles xmlns:r="http://schemas.openxmlformats.org/officeDocument/2006/relationships" xmlns:w="http://schemas.openxmlformats.org/wordprocessingml/2006/main">
+<w:styles xmlns:mc="http://schemas.openxmlformats.org/markup-compatibility/2006" xmlns:r="http://schemas.openxmlformats.org/officeDocument/2006/relationships" xmlns:w="http://schemas.openxmlformats.org/wordprocessingml/2006/main" xmlns:w14="http://schemas.microsoft.com/office/word/2010/wordml" xmlns:w15="http://schemas.microsoft.com/office/word/2012/wordml" xmlns:w16cex="http://schemas.microsoft.com/office/word/2018/wordml/cex" xmlns:w16cid="http://schemas.microsoft.com/office/word/2016/wordml/cid" xmlns:w16="http://schemas.microsoft.com/office/word/2018/wordml" xmlns:w16du="http://schemas.microsoft.com/office/word/2023/wordml/word16du" xmlns:w16sdtdh="http://schemas.microsoft.com/office/word/2020/wordml/sdtdatahash" xmlns:w16sdtfl="http://schemas.microsoft.com/office/word/2024/wordml/sdtformatlock" xmlns:w16se="http://schemas.microsoft.com/office/word/2015/wordml/symex" mc:Ignorable="w14 w15 w16se w16cid w16 w16cex w16sdtdh w16sdtfl w16du">
   <w:docDefaults>
     <w:rPrDefault>
       <w:rPr>
-        <w:rFonts w:asciiTheme="minorHAnsi" w:cstheme="minorBidi" w:eastAsiaTheme="minorEastAsia" w:hAnsiTheme="minorHAnsi"/>
+        <w:rFonts w:asciiTheme="minorHAnsi" w:eastAsiaTheme="minorEastAsia" w:hAnsiTheme="minorHAnsi" w:cstheme="minorBidi"/>
         <w:sz w:val="24"/>
         <w:szCs w:val="24"/>
-        <w:lang w:bidi="ar-SA" w:eastAsia="zh-CN" w:val="en-US"/>
+        <w:lang w:val="en-US" w:eastAsia="zh-CN" w:bidi="ar-SA"/>
       </w:rPr>
     </w:rPrDefault>
     <w:pPrDefault>
@@ -629,193 +585,280 @@
       </w:pPr>
     </w:pPrDefault>
   </w:docDefaults>
-  <w:latentStyles w:count="276" w:defLockedState="0" w:defQFormat="0" w:defSemiHidden="0" w:defUIPriority="0" w:defUnhideWhenUsed="0"/>
-  <w:style w:default="1" w:styleId="Normal" w:type="paragraph">
+  <w:latentStyles w:defLockedState="0" w:defUIPriority="0" w:defSemiHidden="0" w:defUnhideWhenUsed="0" w:defQFormat="0" w:count="376">
+    <w:lsdException w:name="Normal Table" w:semiHidden="1" w:unhideWhenUsed="1"/>
+    <w:lsdException w:name="Table Simple 1" w:semiHidden="1" w:unhideWhenUsed="1"/>
+    <w:lsdException w:name="Table Simple 2" w:semiHidden="1" w:unhideWhenUsed="1"/>
+    <w:lsdException w:name="Table Simple 3" w:semiHidden="1" w:unhideWhenUsed="1"/>
+    <w:lsdException w:name="Table Classic 1" w:semiHidden="1" w:unhideWhenUsed="1"/>
+    <w:lsdException w:name="Table Classic 2" w:semiHidden="1" w:unhideWhenUsed="1"/>
+    <w:lsdException w:name="Table Classic 3" w:semiHidden="1" w:unhideWhenUsed="1"/>
+    <w:lsdException w:name="Table Classic 4" w:semiHidden="1" w:unhideWhenUsed="1"/>
+    <w:lsdException w:name="Table Colorful 1" w:semiHidden="1" w:unhideWhenUsed="1"/>
+    <w:lsdException w:name="Table Colorful 2" w:semiHidden="1" w:unhideWhenUsed="1"/>
+    <w:lsdException w:name="Table Colorful 3" w:semiHidden="1" w:unhideWhenUsed="1"/>
+    <w:lsdException w:name="Table Columns 1" w:semiHidden="1" w:unhideWhenUsed="1"/>
+    <w:lsdException w:name="Table Columns 2" w:semiHidden="1" w:unhideWhenUsed="1"/>
+    <w:lsdException w:name="Table Columns 3" w:semiHidden="1" w:unhideWhenUsed="1"/>
+    <w:lsdException w:name="Table Columns 4" w:semiHidden="1" w:unhideWhenUsed="1"/>
+    <w:lsdException w:name="Table Columns 5" w:semiHidden="1" w:unhideWhenUsed="1"/>
+    <w:lsdException w:name="Table Grid 1" w:semiHidden="1" w:unhideWhenUsed="1"/>
+    <w:lsdException w:name="Table Grid 2" w:semiHidden="1" w:unhideWhenUsed="1"/>
+    <w:lsdException w:name="Table Grid 3" w:semiHidden="1" w:unhideWhenUsed="1"/>
+    <w:lsdException w:name="Table Grid 4" w:semiHidden="1" w:unhideWhenUsed="1"/>
+    <w:lsdException w:name="Table Grid 5" w:semiHidden="1" w:unhideWhenUsed="1"/>
+    <w:lsdException w:name="Table Grid 6" w:semiHidden="1" w:unhideWhenUsed="1"/>
+    <w:lsdException w:name="Table Grid 7" w:semiHidden="1" w:unhideWhenUsed="1"/>
+    <w:lsdException w:name="Table Grid 8" w:semiHidden="1" w:unhideWhenUsed="1"/>
+    <w:lsdException w:name="Table List 1" w:semiHidden="1" w:unhideWhenUsed="1"/>
+    <w:lsdException w:name="Table List 2" w:semiHidden="1" w:unhideWhenUsed="1"/>
+    <w:lsdException w:name="Table List 3" w:semiHidden="1" w:unhideWhenUsed="1"/>
+    <w:lsdException w:name="Table List 4" w:semiHidden="1" w:unhideWhenUsed="1"/>
+    <w:lsdException w:name="Table List 5" w:semiHidden="1" w:unhideWhenUsed="1"/>
+    <w:lsdException w:name="Table List 6" w:semiHidden="1" w:unhideWhenUsed="1"/>
+    <w:lsdException w:name="Table List 7" w:semiHidden="1" w:unhideWhenUsed="1"/>
+    <w:lsdException w:name="Table List 8" w:semiHidden="1" w:unhideWhenUsed="1"/>
+    <w:lsdException w:name="Table 3D effects 1" w:semiHidden="1" w:unhideWhenUsed="1"/>
+    <w:lsdException w:name="Table 3D effects 2" w:semiHidden="1" w:unhideWhenUsed="1"/>
+    <w:lsdException w:name="Table 3D effects 3" w:semiHidden="1" w:unhideWhenUsed="1"/>
+    <w:lsdException w:name="Table Contemporary" w:semiHidden="1" w:unhideWhenUsed="1"/>
+    <w:lsdException w:name="Table Elegant" w:semiHidden="1" w:unhideWhenUsed="1"/>
+    <w:lsdException w:name="Table Professional" w:semiHidden="1" w:unhideWhenUsed="1"/>
+    <w:lsdException w:name="Table Subtle 1" w:semiHidden="1" w:unhideWhenUsed="1"/>
+    <w:lsdException w:name="Table Subtle 2" w:semiHidden="1" w:unhideWhenUsed="1"/>
+    <w:lsdException w:name="Table Web 1" w:semiHidden="1" w:unhideWhenUsed="1"/>
+    <w:lsdException w:name="Table Web 2" w:semiHidden="1" w:unhideWhenUsed="1"/>
+    <w:lsdException w:name="Table Web 3" w:semiHidden="1" w:unhideWhenUsed="1"/>
+    <w:lsdException w:name="Table Theme" w:semiHidden="1" w:unhideWhenUsed="1"/>
+    <w:lsdException w:name="Light Shading"/>
+    <w:lsdException w:name="Light List"/>
+    <w:lsdException w:name="Light Grid"/>
+    <w:lsdException w:name="Medium Shading 1"/>
+    <w:lsdException w:name="Medium Shading 2"/>
+    <w:lsdException w:name="Medium List 1"/>
+    <w:lsdException w:name="Medium List 2"/>
+    <w:lsdException w:name="Medium Grid 1"/>
+    <w:lsdException w:name="Medium Grid 2"/>
+    <w:lsdException w:name="Medium Grid 3"/>
+    <w:lsdException w:name="Dark List"/>
+    <w:lsdException w:name="Colorful Shading"/>
+    <w:lsdException w:name="Colorful List"/>
+    <w:lsdException w:name="Colorful Grid"/>
+    <w:lsdException w:name="Light Shading Accent 1"/>
+    <w:lsdException w:name="Light List Accent 1"/>
+    <w:lsdException w:name="Light Grid Accent 1"/>
+    <w:lsdException w:name="Medium Shading 1 Accent 1"/>
+    <w:lsdException w:name="Medium Shading 2 Accent 1"/>
+    <w:lsdException w:name="Medium List 1 Accent 1"/>
+    <w:lsdException w:name="Medium List 2 Accent 1"/>
+    <w:lsdException w:name="Medium Grid 1 Accent 1"/>
+    <w:lsdException w:name="Medium Grid 2 Accent 1"/>
+    <w:lsdException w:name="Medium Grid 3 Accent 1"/>
+    <w:lsdException w:name="Dark List Accent 1"/>
+    <w:lsdException w:name="Colorful Shading Accent 1"/>
+    <w:lsdException w:name="Colorful List Accent 1"/>
+    <w:lsdException w:name="Colorful Grid Accent 1"/>
+    <w:lsdException w:name="Light Shading Accent 2"/>
+    <w:lsdException w:name="Light List Accent 2"/>
+    <w:lsdException w:name="Light Grid Accent 2"/>
+    <w:lsdException w:name="Medium Shading 1 Accent 2"/>
+    <w:lsdException w:name="Medium Shading 2 Accent 2"/>
+    <w:lsdException w:name="Medium List 1 Accent 2"/>
+    <w:lsdException w:name="Medium List 2 Accent 2"/>
+    <w:lsdException w:name="Medium Grid 1 Accent 2"/>
+    <w:lsdException w:name="Medium Grid 2 Accent 2"/>
+    <w:lsdException w:name="Medium Grid 3 Accent 2"/>
+    <w:lsdException w:name="Dark List Accent 2"/>
+    <w:lsdException w:name="Colorful Shading Accent 2"/>
+    <w:lsdException w:name="Colorful List Accent 2"/>
+    <w:lsdException w:name="Colorful Grid Accent 2"/>
+    <w:lsdException w:name="Light Shading Accent 3"/>
+    <w:lsdException w:name="Light List Accent 3"/>
+    <w:lsdException w:name="Light Grid Accent 3"/>
+    <w:lsdException w:name="Medium Shading 1 Accent 3"/>
+    <w:lsdException w:name="Medium Shading 2 Accent 3"/>
+    <w:lsdException w:name="Medium List 1 Accent 3"/>
+    <w:lsdException w:name="Medium List 2 Accent 3"/>
+    <w:lsdException w:name="Medium Grid 1 Accent 3"/>
+    <w:lsdException w:name="Medium Grid 2 Accent 3"/>
+    <w:lsdException w:name="Medium Grid 3 Accent 3"/>
+    <w:lsdException w:name="Dark List Accent 3"/>
+    <w:lsdException w:name="Colorful Shading Accent 3"/>
+    <w:lsdException w:name="Colorful List Accent 3"/>
+    <w:lsdException w:name="Colorful Grid Accent 3"/>
+    <w:lsdException w:name="Light Shading Accent 4"/>
+    <w:lsdException w:name="Light List Accent 4"/>
+    <w:lsdException w:name="Light Grid Accent 4"/>
+    <w:lsdException w:name="Medium Shading 1 Accent 4"/>
+    <w:lsdException w:name="Medium Shading 2 Accent 4"/>
+    <w:lsdException w:name="Medium List 1 Accent 4"/>
+    <w:lsdException w:name="Medium List 2 Accent 4"/>
+    <w:lsdException w:name="Medium Grid 1 Accent 4"/>
+    <w:lsdException w:name="Medium Grid 2 Accent 4"/>
+    <w:lsdException w:name="Medium Grid 3 Accent 4"/>
+    <w:lsdException w:name="Dark List Accent 4"/>
+    <w:lsdException w:name="Colorful Shading Accent 4"/>
+    <w:lsdException w:name="Colorful List Accent 4"/>
+    <w:lsdException w:name="Colorful Grid Accent 4"/>
+    <w:lsdException w:name="Light Shading Accent 5"/>
+    <w:lsdException w:name="Light List Accent 5"/>
+    <w:lsdException w:name="Light Grid Accent 5"/>
+    <w:lsdException w:name="Medium Shading 1 Accent 5"/>
+    <w:lsdException w:name="Medium Shading 2 Accent 5"/>
+    <w:lsdException w:name="Medium List 1 Accent 5"/>
+    <w:lsdException w:name="Medium List 2 Accent 5"/>
+    <w:lsdException w:name="Medium Grid 1 Accent 5"/>
+    <w:lsdException w:name="Medium Grid 2 Accent 5"/>
+    <w:lsdException w:name="Medium Grid 3 Accent 5"/>
+    <w:lsdException w:name="Dark List Accent 5"/>
+    <w:lsdException w:name="Colorful Shading Accent 5"/>
+    <w:lsdException w:name="Colorful List Accent 5"/>
+    <w:lsdException w:name="Colorful Grid Accent 5"/>
+    <w:lsdException w:name="Light Shading Accent 6"/>
+    <w:lsdException w:name="Light List Accent 6"/>
+    <w:lsdException w:name="Light Grid Accent 6"/>
+    <w:lsdException w:name="Medium Shading 1 Accent 6"/>
+    <w:lsdException w:name="Medium Shading 2 Accent 6"/>
+    <w:lsdException w:name="Medium List 1 Accent 6"/>
+    <w:lsdException w:name="Medium List 2 Accent 6"/>
+    <w:lsdException w:name="Medium Grid 1 Accent 6"/>
+    <w:lsdException w:name="Medium Grid 2 Accent 6"/>
+    <w:lsdException w:name="Medium Grid 3 Accent 6"/>
+    <w:lsdException w:name="Dark List Accent 6"/>
+    <w:lsdException w:name="Colorful Shading Accent 6"/>
+    <w:lsdException w:name="Colorful List Accent 6"/>
+    <w:lsdException w:name="Colorful Grid Accent 6"/>
+    <w:lsdException w:name="Grid Table 4" w:uiPriority="49"/>
+    <w:lsdException w:name="Grid Table 5 Dark" w:uiPriority="50"/>
+    <w:lsdException w:name="Grid Table 6 Colorful" w:uiPriority="51"/>
+    <w:lsdException w:name="Grid Table 7 Colorful" w:uiPriority="52"/>
+    <w:lsdException w:name="Grid Table 1 Light Accent 1" w:uiPriority="46"/>
+    <w:lsdException w:name="Grid Table 2 Accent 1" w:uiPriority="47"/>
+    <w:lsdException w:name="Grid Table 3 Accent 1" w:uiPriority="48"/>
+    <w:lsdException w:name="Grid Table 4 Accent 1" w:uiPriority="49"/>
+    <w:lsdException w:name="Grid Table 5 Dark Accent 1" w:uiPriority="50"/>
+    <w:lsdException w:name="Grid Table 6 Colorful Accent 1" w:uiPriority="51"/>
+    <w:lsdException w:name="Grid Table 7 Colorful Accent 1" w:uiPriority="52"/>
+    <w:lsdException w:name="Grid Table 1 Light Accent 2" w:uiPriority="46"/>
+    <w:lsdException w:name="Grid Table 2 Accent 2" w:uiPriority="47"/>
+    <w:lsdException w:name="Grid Table 3 Accent 2" w:uiPriority="48"/>
+    <w:lsdException w:name="Grid Table 4 Accent 2" w:uiPriority="49"/>
+    <w:lsdException w:name="Grid Table 5 Dark Accent 2" w:uiPriority="50"/>
+    <w:lsdException w:name="Grid Table 6 Colorful Accent 2" w:uiPriority="51"/>
+    <w:lsdException w:name="Grid Table 7 Colorful Accent 2" w:uiPriority="52"/>
+    <w:lsdException w:name="Grid Table 1 Light Accent 3" w:uiPriority="46"/>
+    <w:lsdException w:name="Grid Table 2 Accent 3" w:uiPriority="47"/>
+    <w:lsdException w:name="Grid Table 3 Accent 3" w:uiPriority="48"/>
+    <w:lsdException w:name="Grid Table 4 Accent 3" w:uiPriority="49"/>
+    <w:lsdException w:name="Grid Table 5 Dark Accent 3" w:uiPriority="50"/>
+    <w:lsdException w:name="Grid Table 6 Colorful Accent 3" w:uiPriority="51"/>
+    <w:lsdException w:name="Grid Table 7 Colorful Accent 3" w:uiPriority="52"/>
+    <w:lsdException w:name="Grid Table 1 Light Accent 4" w:uiPriority="46"/>
+    <w:lsdException w:name="Grid Table 2 Accent 4" w:uiPriority="47"/>
+    <w:lsdException w:name="Grid Table 3 Accent 4" w:uiPriority="48"/>
+    <w:lsdException w:name="Grid Table 4 Accent 4" w:uiPriority="49"/>
+    <w:lsdException w:name="Grid Table 5 Dark Accent 4" w:uiPriority="50"/>
+    <w:lsdException w:name="Grid Table 6 Colorful Accent 4" w:uiPriority="51"/>
+    <w:lsdException w:name="Grid Table 7 Colorful Accent 4" w:uiPriority="52"/>
+    <w:lsdException w:name="Grid Table 1 Light Accent 5" w:uiPriority="46"/>
+    <w:lsdException w:name="Grid Table 2 Accent 5" w:uiPriority="47"/>
+    <w:lsdException w:name="Grid Table 3 Accent 5" w:uiPriority="48"/>
+    <w:lsdException w:name="Grid Table 4 Accent 5" w:uiPriority="49"/>
+    <w:lsdException w:name="Grid Table 5 Dark Accent 5" w:uiPriority="50"/>
+    <w:lsdException w:name="Grid Table 6 Colorful Accent 5" w:uiPriority="51"/>
+    <w:lsdException w:name="Grid Table 7 Colorful Accent 5" w:uiPriority="52"/>
+    <w:lsdException w:name="Grid Table 1 Light Accent 6" w:uiPriority="46"/>
+    <w:lsdException w:name="Grid Table 2 Accent 6" w:uiPriority="47"/>
+    <w:lsdException w:name="Grid Table 3 Accent 6" w:uiPriority="48"/>
+    <w:lsdException w:name="Grid Table 4 Accent 6" w:uiPriority="49"/>
+    <w:lsdException w:name="Grid Table 5 Dark Accent 6" w:uiPriority="50"/>
+    <w:lsdException w:name="Grid Table 6 Colorful Accent 6" w:uiPriority="51"/>
+    <w:lsdException w:name="Grid Table 7 Colorful Accent 6" w:uiPriority="52"/>
+    <w:lsdException w:name="List Table 1 Light" w:uiPriority="46"/>
+    <w:lsdException w:name="List Table 2" w:uiPriority="47"/>
+    <w:lsdException w:name="List Table 3" w:uiPriority="48"/>
+    <w:lsdException w:name="List Table 4" w:uiPriority="49"/>
+    <w:lsdException w:name="List Table 5 Dark" w:uiPriority="50"/>
+    <w:lsdException w:name="List Table 6 Colorful" w:uiPriority="51"/>
+    <w:lsdException w:name="List Table 7 Colorful" w:uiPriority="52"/>
+    <w:lsdException w:name="List Table 1 Light Accent 1" w:uiPriority="46"/>
+    <w:lsdException w:name="List Table 2 Accent 1" w:uiPriority="47"/>
+    <w:lsdException w:name="List Table 3 Accent 1" w:uiPriority="48"/>
+    <w:lsdException w:name="List Table 4 Accent 1" w:uiPriority="49"/>
+    <w:lsdException w:name="List Table 5 Dark Accent 1" w:uiPriority="50"/>
+    <w:lsdException w:name="List Table 6 Colorful Accent 1" w:uiPriority="51"/>
+    <w:lsdException w:name="List Table 7 Colorful Accent 1" w:uiPriority="52"/>
+    <w:lsdException w:name="List Table 1 Light Accent 2" w:uiPriority="46"/>
+    <w:lsdException w:name="List Table 2 Accent 2" w:uiPriority="47"/>
+    <w:lsdException w:name="List Table 3 Accent 2" w:uiPriority="48"/>
+    <w:lsdException w:name="List Table 4 Accent 2" w:uiPriority="49"/>
+    <w:lsdException w:name="List Table 5 Dark Accent 2" w:uiPriority="50"/>
+    <w:lsdException w:name="List Table 6 Colorful Accent 2" w:uiPriority="51"/>
+    <w:lsdException w:name="List Table 7 Colorful Accent 2" w:uiPriority="52"/>
+    <w:lsdException w:name="List Table 1 Light Accent 3" w:uiPriority="46"/>
+    <w:lsdException w:name="List Table 2 Accent 3" w:uiPriority="47"/>
+    <w:lsdException w:name="List Table 3 Accent 3" w:uiPriority="48"/>
+    <w:lsdException w:name="List Table 4 Accent 3" w:uiPriority="49"/>
+    <w:lsdException w:name="List Table 5 Dark Accent 3" w:uiPriority="50"/>
+    <w:lsdException w:name="List Table 6 Colorful Accent 3" w:uiPriority="51"/>
+    <w:lsdException w:name="List Table 7 Colorful Accent 3" w:uiPriority="52"/>
+    <w:lsdException w:name="List Table 1 Light Accent 4" w:uiPriority="46"/>
+    <w:lsdException w:name="List Table 2 Accent 4" w:uiPriority="47"/>
+    <w:lsdException w:name="List Table 3 Accent 4" w:uiPriority="48"/>
+    <w:lsdException w:name="List Table 4 Accent 4" w:uiPriority="49"/>
+    <w:lsdException w:name="List Table 5 Dark Accent 4" w:uiPriority="50"/>
+    <w:lsdException w:name="List Table 6 Colorful Accent 4" w:uiPriority="51"/>
+    <w:lsdException w:name="List Table 7 Colorful Accent 4" w:uiPriority="52"/>
+    <w:lsdException w:name="List Table 1 Light Accent 5" w:uiPriority="46"/>
+    <w:lsdException w:name="List Table 2 Accent 5" w:uiPriority="47"/>
+    <w:lsdException w:name="List Table 3 Accent 5" w:uiPriority="48"/>
+    <w:lsdException w:name="List Table 4 Accent 5" w:uiPriority="49"/>
+    <w:lsdException w:name="List Table 5 Dark Accent 5" w:uiPriority="50"/>
+    <w:lsdException w:name="List Table 6 Colorful Accent 5" w:uiPriority="51"/>
+    <w:lsdException w:name="List Table 7 Colorful Accent 5" w:uiPriority="52"/>
+    <w:lsdException w:name="List Table 1 Light Accent 6" w:uiPriority="46"/>
+    <w:lsdException w:name="List Table 2 Accent 6" w:uiPriority="47"/>
+    <w:lsdException w:name="List Table 3 Accent 6" w:uiPriority="48"/>
+    <w:lsdException w:name="List Table 4 Accent 6" w:uiPriority="49"/>
+    <w:lsdException w:name="List Table 5 Dark Accent 6" w:uiPriority="50"/>
+    <w:lsdException w:name="List Table 6 Colorful Accent 6" w:uiPriority="51"/>
+    <w:lsdException w:name="List Table 7 Colorful Accent 6" w:uiPriority="52"/>
+    <w:lsdException w:name="Mention" w:semiHidden="1" w:uiPriority="99" w:unhideWhenUsed="1"/>
+    <w:lsdException w:name="Smart Hyperlink" w:semiHidden="1" w:uiPriority="99" w:unhideWhenUsed="1"/>
+    <w:lsdException w:name="Hashtag" w:semiHidden="1" w:uiPriority="99" w:unhideWhenUsed="1"/>
+    <w:lsdException w:name="Unresolved Mention" w:semiHidden="1" w:uiPriority="99" w:unhideWhenUsed="1"/>
+    <w:lsdException w:name="Smart Link" w:semiHidden="1" w:uiPriority="99" w:unhideWhenUsed="1"/>
+  </w:latentStyles>
+  <w:style w:type="paragraph" w:default="1" w:styleId="a">
     <w:name w:val="Normal"/>
     <w:qFormat/>
   </w:style>
-  <w:style w:styleId="BodyText" w:type="paragraph">
-    <w:name w:val="Body Text"/>
-    <w:basedOn w:val="Normal"/>
-    <w:link w:val="BodyTextChar"/>
-    <w:qFormat/>
-    <w:pPr>
-      <w:spacing w:after="180" w:before="180"/>
-    </w:pPr>
-  </w:style>
-  <w:style w:customStyle="1" w:styleId="FirstParagraph" w:type="paragraph">
-    <w:name w:val="First Paragraph"/>
-    <w:basedOn w:val="BodyText"/>
-    <w:next w:val="BodyText"/>
-    <w:qFormat/>
-  </w:style>
-  <w:style w:customStyle="1" w:styleId="Compact" w:type="paragraph">
-    <w:name w:val="Compact"/>
-    <w:basedOn w:val="BodyText"/>
-    <w:qFormat/>
-    <w:pPr>
-      <w:spacing w:after="36" w:before="36"/>
-    </w:pPr>
-  </w:style>
-  <w:style w:styleId="Title" w:type="paragraph">
-    <w:name w:val="Title"/>
-    <w:basedOn w:val="Normal"/>
-    <w:next w:val="BodyText"/>
-    <w:link w:val="TitleChar"/>
-    <w:uiPriority w:val="10"/>
-    <w:qFormat/>
-    <w:rsid w:val="00A10FD9"/>
-    <w:pPr>
-      <w:spacing w:after="80" w:line="240" w:lineRule="auto"/>
-      <w:contextualSpacing/>
-      <w:jc w:val="center"/>
-    </w:pPr>
-    <w:rPr>
-      <w:rFonts w:asciiTheme="majorHAnsi" w:cstheme="majorBidi" w:eastAsiaTheme="majorEastAsia" w:hAnsiTheme="majorHAnsi"/>
-      <w:sz w:val="56"/>
-      <w:szCs w:val="56"/>
-    </w:rPr>
-  </w:style>
-  <w:style w:customStyle="1" w:styleId="TitleChar" w:type="character">
-    <w:name w:val="Title Char"/>
-    <w:basedOn w:val="DefaultParagraphFont"/>
-    <w:link w:val="Title"/>
-    <w:uiPriority w:val="10"/>
-    <w:rsid w:val="00A10FD9"/>
-    <w:rPr>
-      <w:rFonts w:asciiTheme="majorHAnsi" w:cstheme="majorBidi" w:eastAsiaTheme="majorEastAsia" w:hAnsiTheme="majorHAnsi"/>
-      <w:sz w:val="56"/>
-      <w:szCs w:val="56"/>
-    </w:rPr>
-  </w:style>
-  <w:style w:styleId="Subtitle" w:type="paragraph">
-    <w:name w:val="Subtitle"/>
-    <w:basedOn w:val="Title"/>
-    <w:next w:val="BodyText"/>
-    <w:link w:val="SubtitleChar"/>
-    <w:uiPriority w:val="11"/>
-    <w:qFormat/>
-    <w:rsid w:val="00A10FD9"/>
-    <w:pPr>
-      <w:numPr>
-        <w:ilvl w:val="1"/>
-      </w:numPr>
-    </w:pPr>
-    <w:rPr>
-      <w:rFonts w:cstheme="majorBidi" w:eastAsiaTheme="majorEastAsia"/>
-      <w:spacing w:val="15"/>
-      <w:sz w:val="28"/>
-      <w:szCs w:val="28"/>
-    </w:rPr>
-  </w:style>
-  <w:style w:customStyle="1" w:styleId="SubtitleChar" w:type="character">
-    <w:name w:val="Subtitle Char"/>
-    <w:basedOn w:val="DefaultParagraphFont"/>
-    <w:link w:val="Subtitle"/>
-    <w:uiPriority w:val="11"/>
-    <w:rsid w:val="00A10FD9"/>
-    <w:rPr>
-      <w:rFonts w:cstheme="majorBidi" w:eastAsiaTheme="majorEastAsia"/>
-      <w:color w:themeColor="text1" w:themeTint="A6" w:val="595959"/>
-      <w:spacing w:val="15"/>
-      <w:sz w:val="28"/>
-      <w:szCs w:val="28"/>
-    </w:rPr>
-  </w:style>
-  <w:style w:customStyle="1" w:styleId="Author" w:type="paragraph">
-    <w:name w:val="Author"/>
-    <w:basedOn w:val="Title"/>
-    <w:next w:val="BodyText"/>
-    <w:qFormat/>
+  <w:style w:type="paragraph" w:styleId="1">
+    <w:name w:val="heading 1"/>
+    <w:basedOn w:val="a"/>
+    <w:next w:val="a0"/>
+    <w:link w:val="10"/>
+    <w:uiPriority w:val="9"/>
+    <w:qFormat/>
+    <w:rsid w:val="00A10FD9"/>
     <w:pPr>
       <w:keepNext/>
       <w:keepLines/>
-    </w:pPr>
-    <w:rPr>
-      <w:sz w:val="24"/>
-      <w:szCs w:val="24"/>
-    </w:rPr>
-  </w:style>
-  <w:style w:styleId="Date" w:type="paragraph">
-    <w:name w:val="Date"/>
-    <w:basedOn w:val="Title"/>
-    <w:next w:val="BodyText"/>
-    <w:qFormat/>
-    <w:pPr>
-      <w:keepNext/>
-      <w:keepLines/>
-    </w:pPr>
-    <w:rPr>
-      <w:sz w:val="24"/>
-      <w:szCs w:val="24"/>
-    </w:rPr>
-  </w:style>
-  <w:style w:customStyle="1" w:styleId="AbstractTitle" w:type="paragraph">
-    <w:name w:val="Abstract Title"/>
-    <w:basedOn w:val="Normal"/>
-    <w:next w:val="Abstract"/>
-    <w:qFormat/>
-    <w:pPr>
-      <w:keepNext/>
-      <w:keepLines/>
-      <w:spacing w:after="0" w:before="300"/>
-      <w:jc w:val="center"/>
-    </w:pPr>
-    <w:rPr>
-      <w:b/>
-      <w:sz w:val="20"/>
-      <w:szCs w:val="20"/>
-    </w:rPr>
-  </w:style>
-  <w:style w:customStyle="1" w:styleId="Abstract" w:type="paragraph">
-    <w:name w:val="Abstract"/>
-    <w:basedOn w:val="Normal"/>
-    <w:next w:val="BodyText"/>
-    <w:qFormat/>
-    <w:pPr>
-      <w:keepNext/>
-      <w:keepLines/>
-      <w:spacing w:after="300" w:before="100"/>
-    </w:pPr>
-    <w:rPr>
-      <w:sz w:val="20"/>
-      <w:szCs w:val="20"/>
-    </w:rPr>
-  </w:style>
-  <w:style w:styleId="Bibliography" w:type="paragraph">
-    <w:name w:val="Bibliography"/>
-    <w:basedOn w:val="Normal"/>
-    <w:next w:val="Bibliography"/>
-    <w:qFormat/>
-    <w:pPr/>
-    <w:rPr/>
-  </w:style>
-  <w:style w:styleId="Heading1" w:type="paragraph">
-    <w:name w:val="heading 1"/>
-    <w:basedOn w:val="Normal"/>
-    <w:next w:val="BodyText"/>
-    <w:link w:val="Heading1Char"/>
-    <w:uiPriority w:val="9"/>
-    <w:qFormat/>
-    <w:rsid w:val="00A10FD9"/>
-    <w:pPr>
-      <w:keepNext/>
-      <w:keepLines/>
-      <w:spacing w:after="80" w:before="360"/>
+      <w:spacing w:before="360" w:after="80"/>
       <w:outlineLvl w:val="0"/>
     </w:pPr>
     <w:rPr>
-      <w:rFonts w:asciiTheme="majorHAnsi" w:cstheme="majorBidi" w:eastAsiaTheme="majorEastAsia" w:hAnsiTheme="majorHAnsi"/>
-      <w:color w:themeColor="accent1" w:themeShade="BF" w:val="0F4761"/>
+      <w:rFonts w:asciiTheme="majorHAnsi" w:eastAsiaTheme="majorEastAsia" w:hAnsiTheme="majorHAnsi" w:cstheme="majorBidi"/>
+      <w:color w:val="0F4761" w:themeColor="accent1" w:themeShade="BF"/>
       <w:sz w:val="40"/>
       <w:szCs w:val="40"/>
     </w:rPr>
   </w:style>
-  <w:style w:styleId="Heading2" w:type="paragraph">
+  <w:style w:type="paragraph" w:styleId="2">
     <w:name w:val="heading 2"/>
-    <w:basedOn w:val="Normal"/>
-    <w:next w:val="BodyText"/>
-    <w:link w:val="Heading2Char"/>
+    <w:basedOn w:val="a"/>
+    <w:next w:val="a0"/>
+    <w:link w:val="20"/>
     <w:uiPriority w:val="9"/>
     <w:semiHidden/>
     <w:unhideWhenUsed/>
@@ -824,21 +867,21 @@
     <w:pPr>
       <w:keepNext/>
       <w:keepLines/>
-      <w:spacing w:after="80" w:before="160"/>
+      <w:spacing w:before="160" w:after="80"/>
       <w:outlineLvl w:val="1"/>
     </w:pPr>
     <w:rPr>
-      <w:rFonts w:asciiTheme="majorHAnsi" w:cstheme="majorBidi" w:eastAsiaTheme="majorEastAsia" w:hAnsiTheme="majorHAnsi"/>
-      <w:color w:themeColor="accent1" w:themeShade="BF" w:val="0F4761"/>
+      <w:rFonts w:asciiTheme="majorHAnsi" w:eastAsiaTheme="majorEastAsia" w:hAnsiTheme="majorHAnsi" w:cstheme="majorBidi"/>
+      <w:color w:val="0F4761" w:themeColor="accent1" w:themeShade="BF"/>
       <w:sz w:val="32"/>
       <w:szCs w:val="32"/>
     </w:rPr>
   </w:style>
-  <w:style w:styleId="Heading3" w:type="paragraph">
+  <w:style w:type="paragraph" w:styleId="3">
     <w:name w:val="heading 3"/>
-    <w:basedOn w:val="Normal"/>
-    <w:next w:val="BodyText"/>
-    <w:link w:val="Heading3Char"/>
+    <w:basedOn w:val="a"/>
+    <w:next w:val="a0"/>
+    <w:link w:val="30"/>
     <w:uiPriority w:val="9"/>
     <w:semiHidden/>
     <w:unhideWhenUsed/>
@@ -847,21 +890,21 @@
     <w:pPr>
       <w:keepNext/>
       <w:keepLines/>
-      <w:spacing w:after="80" w:before="160"/>
+      <w:spacing w:before="160" w:after="80"/>
       <w:outlineLvl w:val="2"/>
     </w:pPr>
     <w:rPr>
-      <w:rFonts w:cstheme="majorBidi" w:eastAsiaTheme="majorEastAsia"/>
-      <w:color w:themeColor="accent1" w:themeShade="BF" w:val="0F4761"/>
+      <w:rFonts w:eastAsiaTheme="majorEastAsia" w:cstheme="majorBidi"/>
+      <w:color w:val="0F4761" w:themeColor="accent1" w:themeShade="BF"/>
       <w:sz w:val="28"/>
       <w:szCs w:val="28"/>
     </w:rPr>
   </w:style>
-  <w:style w:styleId="Heading4" w:type="paragraph">
+  <w:style w:type="paragraph" w:styleId="4">
     <w:name w:val="heading 4"/>
-    <w:basedOn w:val="Normal"/>
-    <w:next w:val="BodyText"/>
-    <w:link w:val="Heading4Char"/>
+    <w:basedOn w:val="a"/>
+    <w:next w:val="a0"/>
+    <w:link w:val="40"/>
     <w:uiPriority w:val="9"/>
     <w:semiHidden/>
     <w:unhideWhenUsed/>
@@ -870,21 +913,21 @@
     <w:pPr>
       <w:keepNext/>
       <w:keepLines/>
-      <w:spacing w:after="40" w:before="80"/>
+      <w:spacing w:before="80" w:after="40"/>
       <w:outlineLvl w:val="3"/>
     </w:pPr>
     <w:rPr>
-      <w:rFonts w:cstheme="majorBidi" w:eastAsiaTheme="majorEastAsia"/>
+      <w:rFonts w:eastAsiaTheme="majorEastAsia" w:cstheme="majorBidi"/>
       <w:i/>
       <w:iCs/>
-      <w:color w:themeColor="accent1" w:themeShade="BF" w:val="0F4761"/>
-    </w:rPr>
-  </w:style>
-  <w:style w:styleId="Heading5" w:type="paragraph">
+      <w:color w:val="0F4761" w:themeColor="accent1" w:themeShade="BF"/>
+    </w:rPr>
+  </w:style>
+  <w:style w:type="paragraph" w:styleId="5">
     <w:name w:val="heading 5"/>
-    <w:basedOn w:val="Normal"/>
-    <w:next w:val="BodyText"/>
-    <w:link w:val="Heading5Char"/>
+    <w:basedOn w:val="a"/>
+    <w:next w:val="a0"/>
+    <w:link w:val="50"/>
     <w:uiPriority w:val="9"/>
     <w:semiHidden/>
     <w:unhideWhenUsed/>
@@ -893,19 +936,19 @@
     <w:pPr>
       <w:keepNext/>
       <w:keepLines/>
-      <w:spacing w:after="40" w:before="80"/>
+      <w:spacing w:before="80" w:after="40"/>
       <w:outlineLvl w:val="4"/>
     </w:pPr>
     <w:rPr>
-      <w:rFonts w:cstheme="majorBidi" w:eastAsiaTheme="majorEastAsia"/>
-      <w:color w:themeColor="accent1" w:themeShade="BF" w:val="0F4761"/>
-    </w:rPr>
-  </w:style>
-  <w:style w:styleId="Heading6" w:type="paragraph">
+      <w:rFonts w:eastAsiaTheme="majorEastAsia" w:cstheme="majorBidi"/>
+      <w:color w:val="0F4761" w:themeColor="accent1" w:themeShade="BF"/>
+    </w:rPr>
+  </w:style>
+  <w:style w:type="paragraph" w:styleId="6">
     <w:name w:val="heading 6"/>
-    <w:basedOn w:val="Normal"/>
-    <w:next w:val="BodyText"/>
-    <w:link w:val="Heading6Char"/>
+    <w:basedOn w:val="a"/>
+    <w:next w:val="a0"/>
+    <w:link w:val="60"/>
     <w:uiPriority w:val="9"/>
     <w:semiHidden/>
     <w:unhideWhenUsed/>
@@ -914,21 +957,21 @@
     <w:pPr>
       <w:keepNext/>
       <w:keepLines/>
-      <w:spacing w:after="0" w:before="40"/>
+      <w:spacing w:before="40" w:after="0"/>
       <w:outlineLvl w:val="5"/>
     </w:pPr>
     <w:rPr>
-      <w:rFonts w:cstheme="majorBidi" w:eastAsiaTheme="majorEastAsia"/>
+      <w:rFonts w:eastAsiaTheme="majorEastAsia" w:cstheme="majorBidi"/>
       <w:i/>
       <w:iCs/>
-      <w:color w:themeColor="text1" w:themeTint="A6" w:val="595959"/>
-    </w:rPr>
-  </w:style>
-  <w:style w:styleId="Heading7" w:type="paragraph">
+      <w:color w:val="595959" w:themeColor="text1" w:themeTint="A6"/>
+    </w:rPr>
+  </w:style>
+  <w:style w:type="paragraph" w:styleId="7">
     <w:name w:val="heading 7"/>
-    <w:basedOn w:val="Normal"/>
-    <w:next w:val="BodyText"/>
-    <w:link w:val="Heading7Char"/>
+    <w:basedOn w:val="a"/>
+    <w:next w:val="a0"/>
+    <w:link w:val="70"/>
     <w:uiPriority w:val="9"/>
     <w:semiHidden/>
     <w:unhideWhenUsed/>
@@ -937,19 +980,19 @@
     <w:pPr>
       <w:keepNext/>
       <w:keepLines/>
-      <w:spacing w:after="0" w:before="40"/>
+      <w:spacing w:before="40" w:after="0"/>
       <w:outlineLvl w:val="6"/>
     </w:pPr>
     <w:rPr>
-      <w:rFonts w:cstheme="majorBidi" w:eastAsiaTheme="majorEastAsia"/>
-      <w:color w:themeColor="text1" w:themeTint="A6" w:val="595959"/>
-    </w:rPr>
-  </w:style>
-  <w:style w:styleId="Heading8" w:type="paragraph">
+      <w:rFonts w:eastAsiaTheme="majorEastAsia" w:cstheme="majorBidi"/>
+      <w:color w:val="595959" w:themeColor="text1" w:themeTint="A6"/>
+    </w:rPr>
+  </w:style>
+  <w:style w:type="paragraph" w:styleId="8">
     <w:name w:val="heading 8"/>
-    <w:basedOn w:val="Normal"/>
-    <w:next w:val="BodyText"/>
-    <w:link w:val="Heading8Char"/>
+    <w:basedOn w:val="a"/>
+    <w:next w:val="a0"/>
+    <w:link w:val="80"/>
     <w:uiPriority w:val="9"/>
     <w:semiHidden/>
     <w:unhideWhenUsed/>
@@ -962,17 +1005,17 @@
       <w:outlineLvl w:val="7"/>
     </w:pPr>
     <w:rPr>
-      <w:rFonts w:cstheme="majorBidi" w:eastAsiaTheme="majorEastAsia"/>
+      <w:rFonts w:eastAsiaTheme="majorEastAsia" w:cstheme="majorBidi"/>
       <w:i/>
       <w:iCs/>
-      <w:color w:themeColor="text1" w:themeTint="D8" w:val="272727"/>
-    </w:rPr>
-  </w:style>
-  <w:style w:styleId="Heading9" w:type="paragraph">
+      <w:color w:val="272727" w:themeColor="text1" w:themeTint="D8"/>
+    </w:rPr>
+  </w:style>
+  <w:style w:type="paragraph" w:styleId="9">
     <w:name w:val="heading 9"/>
-    <w:basedOn w:val="Normal"/>
-    <w:next w:val="BodyText"/>
-    <w:link w:val="Heading9Char"/>
+    <w:basedOn w:val="a"/>
+    <w:next w:val="a0"/>
+    <w:link w:val="90"/>
     <w:uiPriority w:val="9"/>
     <w:semiHidden/>
     <w:unhideWhenUsed/>
@@ -985,193 +1028,365 @@
       <w:outlineLvl w:val="8"/>
     </w:pPr>
     <w:rPr>
-      <w:rFonts w:cstheme="majorBidi" w:eastAsiaTheme="majorEastAsia"/>
-      <w:color w:themeColor="text1" w:themeTint="D8" w:val="272727"/>
-    </w:rPr>
-  </w:style>
-  <w:style w:customStyle="1" w:styleId="Heading1Char" w:type="character">
-    <w:name w:val="Heading 1 Char"/>
-    <w:basedOn w:val="DefaultParagraphFont"/>
-    <w:link w:val="Heading1"/>
+      <w:rFonts w:eastAsiaTheme="majorEastAsia" w:cstheme="majorBidi"/>
+      <w:color w:val="272727" w:themeColor="text1" w:themeTint="D8"/>
+    </w:rPr>
+  </w:style>
+  <w:style w:type="character" w:default="1" w:styleId="a1">
+    <w:name w:val="Default Paragraph Font"/>
+    <w:uiPriority w:val="1"/>
+    <w:semiHidden/>
+    <w:unhideWhenUsed/>
+  </w:style>
+  <w:style w:type="table" w:default="1" w:styleId="a2">
+    <w:name w:val="Normal Table"/>
+    <w:uiPriority w:val="99"/>
+    <w:semiHidden/>
+    <w:unhideWhenUsed/>
+    <w:tblPr>
+      <w:tblInd w:w="0" w:type="dxa"/>
+      <w:tblCellMar>
+        <w:top w:w="0" w:type="dxa"/>
+        <w:left w:w="108" w:type="dxa"/>
+        <w:bottom w:w="0" w:type="dxa"/>
+        <w:right w:w="108" w:type="dxa"/>
+      </w:tblCellMar>
+    </w:tblPr>
+  </w:style>
+  <w:style w:type="numbering" w:default="1" w:styleId="a3">
+    <w:name w:val="No List"/>
+    <w:uiPriority w:val="99"/>
+    <w:semiHidden/>
+    <w:unhideWhenUsed/>
+  </w:style>
+  <w:style w:type="paragraph" w:styleId="a0">
+    <w:name w:val="Body Text"/>
+    <w:basedOn w:val="a"/>
+    <w:qFormat/>
+    <w:pPr>
+      <w:spacing w:before="180" w:after="180"/>
+    </w:pPr>
+  </w:style>
+  <w:style w:type="paragraph" w:customStyle="1" w:styleId="FirstParagraph">
+    <w:name w:val="First Paragraph"/>
+    <w:basedOn w:val="a0"/>
+    <w:next w:val="a0"/>
+    <w:qFormat/>
+  </w:style>
+  <w:style w:type="paragraph" w:customStyle="1" w:styleId="Compact">
+    <w:name w:val="Compact"/>
+    <w:basedOn w:val="a0"/>
+    <w:qFormat/>
+    <w:pPr>
+      <w:spacing w:before="36" w:after="36"/>
+    </w:pPr>
+  </w:style>
+  <w:style w:type="paragraph" w:styleId="a4">
+    <w:name w:val="Title"/>
+    <w:basedOn w:val="a"/>
+    <w:next w:val="a0"/>
+    <w:link w:val="a5"/>
+    <w:uiPriority w:val="10"/>
+    <w:qFormat/>
+    <w:rsid w:val="00A10FD9"/>
+    <w:pPr>
+      <w:spacing w:after="80"/>
+      <w:contextualSpacing/>
+      <w:jc w:val="center"/>
+    </w:pPr>
+    <w:rPr>
+      <w:rFonts w:asciiTheme="majorHAnsi" w:eastAsiaTheme="majorEastAsia" w:hAnsiTheme="majorHAnsi" w:cstheme="majorBidi"/>
+      <w:sz w:val="56"/>
+      <w:szCs w:val="56"/>
+    </w:rPr>
+  </w:style>
+  <w:style w:type="character" w:customStyle="1" w:styleId="a5">
+    <w:name w:val="表題 (文字)"/>
+    <w:basedOn w:val="a1"/>
+    <w:link w:val="a4"/>
+    <w:uiPriority w:val="10"/>
+    <w:rsid w:val="00A10FD9"/>
+    <w:rPr>
+      <w:rFonts w:asciiTheme="majorHAnsi" w:eastAsiaTheme="majorEastAsia" w:hAnsiTheme="majorHAnsi" w:cstheme="majorBidi"/>
+      <w:sz w:val="56"/>
+      <w:szCs w:val="56"/>
+    </w:rPr>
+  </w:style>
+  <w:style w:type="paragraph" w:styleId="a6">
+    <w:name w:val="Subtitle"/>
+    <w:basedOn w:val="a4"/>
+    <w:next w:val="a0"/>
+    <w:link w:val="a7"/>
+    <w:uiPriority w:val="11"/>
+    <w:qFormat/>
+    <w:rsid w:val="00A10FD9"/>
+    <w:pPr>
+      <w:numPr>
+        <w:ilvl w:val="1"/>
+      </w:numPr>
+    </w:pPr>
+    <w:rPr>
+      <w:spacing w:val="15"/>
+      <w:sz w:val="28"/>
+      <w:szCs w:val="28"/>
+    </w:rPr>
+  </w:style>
+  <w:style w:type="character" w:customStyle="1" w:styleId="a7">
+    <w:name w:val="副題 (文字)"/>
+    <w:basedOn w:val="a1"/>
+    <w:link w:val="a6"/>
+    <w:uiPriority w:val="11"/>
+    <w:rsid w:val="00A10FD9"/>
+    <w:rPr>
+      <w:rFonts w:eastAsiaTheme="majorEastAsia" w:cstheme="majorBidi"/>
+      <w:color w:val="595959" w:themeColor="text1" w:themeTint="A6"/>
+      <w:spacing w:val="15"/>
+      <w:sz w:val="28"/>
+      <w:szCs w:val="28"/>
+    </w:rPr>
+  </w:style>
+  <w:style w:type="paragraph" w:customStyle="1" w:styleId="Author">
+    <w:name w:val="Author"/>
+    <w:basedOn w:val="a4"/>
+    <w:next w:val="a0"/>
+    <w:qFormat/>
+    <w:pPr>
+      <w:keepNext/>
+      <w:keepLines/>
+    </w:pPr>
+    <w:rPr>
+      <w:sz w:val="24"/>
+      <w:szCs w:val="24"/>
+    </w:rPr>
+  </w:style>
+  <w:style w:type="paragraph" w:styleId="a8">
+    <w:name w:val="Date"/>
+    <w:basedOn w:val="a4"/>
+    <w:next w:val="a0"/>
+    <w:qFormat/>
+    <w:pPr>
+      <w:keepNext/>
+      <w:keepLines/>
+    </w:pPr>
+    <w:rPr>
+      <w:sz w:val="24"/>
+      <w:szCs w:val="24"/>
+    </w:rPr>
+  </w:style>
+  <w:style w:type="paragraph" w:customStyle="1" w:styleId="AbstractTitle">
+    <w:name w:val="Abstract Title"/>
+    <w:basedOn w:val="a"/>
+    <w:next w:val="Abstract"/>
+    <w:qFormat/>
+    <w:pPr>
+      <w:keepNext/>
+      <w:keepLines/>
+      <w:spacing w:before="300" w:after="0"/>
+      <w:jc w:val="center"/>
+    </w:pPr>
+    <w:rPr>
+      <w:b/>
+      <w:sz w:val="20"/>
+      <w:szCs w:val="20"/>
+    </w:rPr>
+  </w:style>
+  <w:style w:type="paragraph" w:customStyle="1" w:styleId="Abstract">
+    <w:name w:val="Abstract"/>
+    <w:basedOn w:val="a"/>
+    <w:next w:val="a0"/>
+    <w:qFormat/>
+    <w:pPr>
+      <w:keepNext/>
+      <w:keepLines/>
+      <w:spacing w:before="100" w:after="300"/>
+    </w:pPr>
+    <w:rPr>
+      <w:sz w:val="20"/>
+      <w:szCs w:val="20"/>
+    </w:rPr>
+  </w:style>
+  <w:style w:type="paragraph" w:styleId="a9">
+    <w:name w:val="Bibliography"/>
+    <w:basedOn w:val="a"/>
+    <w:qFormat/>
+  </w:style>
+  <w:style w:type="character" w:customStyle="1" w:styleId="10">
+    <w:name w:val="見出し 1 (文字)"/>
+    <w:basedOn w:val="a1"/>
+    <w:link w:val="1"/>
     <w:uiPriority w:val="9"/>
     <w:rsid w:val="00A10FD9"/>
     <w:rPr>
-      <w:rFonts w:asciiTheme="majorHAnsi" w:cstheme="majorBidi" w:eastAsiaTheme="majorEastAsia" w:hAnsiTheme="majorHAnsi"/>
-      <w:color w:themeColor="accent1" w:themeShade="BF" w:val="0F4761"/>
+      <w:rFonts w:asciiTheme="majorHAnsi" w:eastAsiaTheme="majorEastAsia" w:hAnsiTheme="majorHAnsi" w:cstheme="majorBidi"/>
+      <w:color w:val="0F4761" w:themeColor="accent1" w:themeShade="BF"/>
       <w:sz w:val="40"/>
       <w:szCs w:val="40"/>
     </w:rPr>
   </w:style>
-  <w:style w:customStyle="1" w:styleId="Heading2Char" w:type="character">
-    <w:name w:val="Heading 2 Char"/>
-    <w:basedOn w:val="DefaultParagraphFont"/>
-    <w:link w:val="Heading2"/>
+  <w:style w:type="character" w:customStyle="1" w:styleId="20">
+    <w:name w:val="見出し 2 (文字)"/>
+    <w:basedOn w:val="a1"/>
+    <w:link w:val="2"/>
     <w:uiPriority w:val="9"/>
     <w:semiHidden/>
     <w:rsid w:val="00A10FD9"/>
     <w:rPr>
-      <w:rFonts w:asciiTheme="majorHAnsi" w:cstheme="majorBidi" w:eastAsiaTheme="majorEastAsia" w:hAnsiTheme="majorHAnsi"/>
-      <w:color w:themeColor="accent1" w:themeShade="BF" w:val="0F4761"/>
+      <w:rFonts w:asciiTheme="majorHAnsi" w:eastAsiaTheme="majorEastAsia" w:hAnsiTheme="majorHAnsi" w:cstheme="majorBidi"/>
+      <w:color w:val="0F4761" w:themeColor="accent1" w:themeShade="BF"/>
       <w:sz w:val="32"/>
       <w:szCs w:val="32"/>
     </w:rPr>
   </w:style>
-  <w:style w:customStyle="1" w:styleId="Heading3Char" w:type="character">
-    <w:name w:val="Heading 3 Char"/>
-    <w:basedOn w:val="DefaultParagraphFont"/>
-    <w:link w:val="Heading3"/>
+  <w:style w:type="character" w:customStyle="1" w:styleId="30">
+    <w:name w:val="見出し 3 (文字)"/>
+    <w:basedOn w:val="a1"/>
+    <w:link w:val="3"/>
     <w:uiPriority w:val="9"/>
     <w:semiHidden/>
     <w:rsid w:val="00A10FD9"/>
     <w:rPr>
-      <w:rFonts w:cstheme="majorBidi" w:eastAsiaTheme="majorEastAsia"/>
-      <w:color w:themeColor="accent1" w:themeShade="BF" w:val="0F4761"/>
+      <w:rFonts w:eastAsiaTheme="majorEastAsia" w:cstheme="majorBidi"/>
+      <w:color w:val="0F4761" w:themeColor="accent1" w:themeShade="BF"/>
       <w:sz w:val="28"/>
       <w:szCs w:val="28"/>
     </w:rPr>
   </w:style>
-  <w:style w:customStyle="1" w:styleId="Heading4Char" w:type="character">
-    <w:name w:val="Heading 4 Char"/>
-    <w:basedOn w:val="DefaultParagraphFont"/>
-    <w:link w:val="Heading4"/>
+  <w:style w:type="character" w:customStyle="1" w:styleId="40">
+    <w:name w:val="見出し 4 (文字)"/>
+    <w:basedOn w:val="a1"/>
+    <w:link w:val="4"/>
     <w:uiPriority w:val="9"/>
     <w:semiHidden/>
     <w:rsid w:val="00A10FD9"/>
     <w:rPr>
-      <w:rFonts w:cstheme="majorBidi" w:eastAsiaTheme="majorEastAsia"/>
+      <w:rFonts w:eastAsiaTheme="majorEastAsia" w:cstheme="majorBidi"/>
       <w:i/>
       <w:iCs/>
-      <w:color w:themeColor="accent1" w:themeShade="BF" w:val="0F4761"/>
-    </w:rPr>
-  </w:style>
-  <w:style w:customStyle="1" w:styleId="Heading5Char" w:type="character">
-    <w:name w:val="Heading 5 Char"/>
-    <w:basedOn w:val="DefaultParagraphFont"/>
-    <w:link w:val="Heading5"/>
+      <w:color w:val="0F4761" w:themeColor="accent1" w:themeShade="BF"/>
+    </w:rPr>
+  </w:style>
+  <w:style w:type="character" w:customStyle="1" w:styleId="50">
+    <w:name w:val="見出し 5 (文字)"/>
+    <w:basedOn w:val="a1"/>
+    <w:link w:val="5"/>
     <w:uiPriority w:val="9"/>
     <w:semiHidden/>
     <w:rsid w:val="00A10FD9"/>
     <w:rPr>
-      <w:rFonts w:cstheme="majorBidi" w:eastAsiaTheme="majorEastAsia"/>
-      <w:color w:themeColor="accent1" w:themeShade="BF" w:val="0F4761"/>
-    </w:rPr>
-  </w:style>
-  <w:style w:customStyle="1" w:styleId="Heading6Char" w:type="character">
-    <w:name w:val="Heading 6 Char"/>
-    <w:basedOn w:val="DefaultParagraphFont"/>
-    <w:link w:val="Heading6"/>
+      <w:rFonts w:eastAsiaTheme="majorEastAsia" w:cstheme="majorBidi"/>
+      <w:color w:val="0F4761" w:themeColor="accent1" w:themeShade="BF"/>
+    </w:rPr>
+  </w:style>
+  <w:style w:type="character" w:customStyle="1" w:styleId="60">
+    <w:name w:val="見出し 6 (文字)"/>
+    <w:basedOn w:val="a1"/>
+    <w:link w:val="6"/>
     <w:uiPriority w:val="9"/>
     <w:semiHidden/>
     <w:rsid w:val="00A10FD9"/>
     <w:rPr>
-      <w:rFonts w:cstheme="majorBidi" w:eastAsiaTheme="majorEastAsia"/>
+      <w:rFonts w:eastAsiaTheme="majorEastAsia" w:cstheme="majorBidi"/>
       <w:i/>
       <w:iCs/>
-      <w:color w:themeColor="text1" w:themeTint="A6" w:val="595959"/>
-    </w:rPr>
-  </w:style>
-  <w:style w:customStyle="1" w:styleId="Heading7Char" w:type="character">
-    <w:name w:val="Heading 7 Char"/>
-    <w:basedOn w:val="DefaultParagraphFont"/>
-    <w:link w:val="Heading7"/>
+      <w:color w:val="595959" w:themeColor="text1" w:themeTint="A6"/>
+    </w:rPr>
+  </w:style>
+  <w:style w:type="character" w:customStyle="1" w:styleId="70">
+    <w:name w:val="見出し 7 (文字)"/>
+    <w:basedOn w:val="a1"/>
+    <w:link w:val="7"/>
     <w:uiPriority w:val="9"/>
     <w:semiHidden/>
     <w:rsid w:val="00A10FD9"/>
     <w:rPr>
-      <w:rFonts w:cstheme="majorBidi" w:eastAsiaTheme="majorEastAsia"/>
-      <w:color w:themeColor="text1" w:themeTint="A6" w:val="595959"/>
-    </w:rPr>
-  </w:style>
-  <w:style w:customStyle="1" w:styleId="Heading8Char" w:type="character">
-    <w:name w:val="Heading 8 Char"/>
-    <w:basedOn w:val="DefaultParagraphFont"/>
-    <w:link w:val="Heading8"/>
+      <w:rFonts w:eastAsiaTheme="majorEastAsia" w:cstheme="majorBidi"/>
+      <w:color w:val="595959" w:themeColor="text1" w:themeTint="A6"/>
+    </w:rPr>
+  </w:style>
+  <w:style w:type="character" w:customStyle="1" w:styleId="80">
+    <w:name w:val="見出し 8 (文字)"/>
+    <w:basedOn w:val="a1"/>
+    <w:link w:val="8"/>
     <w:uiPriority w:val="9"/>
     <w:semiHidden/>
     <w:rsid w:val="00A10FD9"/>
     <w:rPr>
-      <w:rFonts w:cstheme="majorBidi" w:eastAsiaTheme="majorEastAsia"/>
+      <w:rFonts w:eastAsiaTheme="majorEastAsia" w:cstheme="majorBidi"/>
       <w:i/>
       <w:iCs/>
-      <w:color w:themeColor="text1" w:themeTint="D8" w:val="272727"/>
-    </w:rPr>
-  </w:style>
-  <w:style w:customStyle="1" w:styleId="Heading9Char" w:type="character">
-    <w:name w:val="Heading 9 Char"/>
-    <w:basedOn w:val="DefaultParagraphFont"/>
-    <w:link w:val="Heading9"/>
+      <w:color w:val="272727" w:themeColor="text1" w:themeTint="D8"/>
+    </w:rPr>
+  </w:style>
+  <w:style w:type="character" w:customStyle="1" w:styleId="90">
+    <w:name w:val="見出し 9 (文字)"/>
+    <w:basedOn w:val="a1"/>
+    <w:link w:val="9"/>
     <w:uiPriority w:val="9"/>
     <w:semiHidden/>
     <w:rsid w:val="00A10FD9"/>
     <w:rPr>
-      <w:rFonts w:cstheme="majorBidi" w:eastAsiaTheme="majorEastAsia"/>
-      <w:color w:themeColor="text1" w:themeTint="D8" w:val="272727"/>
-    </w:rPr>
-  </w:style>
-  <w:style w:styleId="BlockText" w:type="paragraph">
+      <w:rFonts w:eastAsiaTheme="majorEastAsia" w:cstheme="majorBidi"/>
+      <w:color w:val="272727" w:themeColor="text1" w:themeTint="D8"/>
+    </w:rPr>
+  </w:style>
+  <w:style w:type="paragraph" w:styleId="aa">
     <w:name w:val="Block Text"/>
-    <w:basedOn w:val="BodyText"/>
-    <w:next w:val="BodyText"/>
+    <w:basedOn w:val="a0"/>
+    <w:next w:val="a0"/>
     <w:uiPriority w:val="9"/>
     <w:unhideWhenUsed/>
     <w:qFormat/>
     <w:pPr>
-      <w:spacing w:after="100" w:before="100"/>
-      <w:ind w:firstLine="0" w:left="480" w:right="480"/>
-    </w:pPr>
-  </w:style>
-  <w:style w:styleId="FootnoteText" w:type="paragraph">
-    <w:name w:val="Footnote Text"/>
-    <w:basedOn w:val="Normal"/>
-    <w:next w:val="FootnoteText"/>
+      <w:spacing w:before="100" w:after="100"/>
+      <w:ind w:left="480" w:right="480"/>
+    </w:pPr>
+  </w:style>
+  <w:style w:type="paragraph" w:styleId="ab">
+    <w:name w:val="footnote text"/>
+    <w:basedOn w:val="a"/>
     <w:uiPriority w:val="9"/>
     <w:unhideWhenUsed/>
     <w:qFormat/>
   </w:style>
-  <w:style w:styleId="FootnoteBlockText" w:type="paragraph">
+  <w:style w:type="paragraph" w:customStyle="1" w:styleId="FootnoteBlockText">
     <w:name w:val="Footnote Block Text"/>
-    <w:basedOn w:val="FootnoteText"/>
-    <w:next w:val="FootnoteText"/>
+    <w:basedOn w:val="ab"/>
+    <w:next w:val="ab"/>
     <w:uiPriority w:val="9"/>
     <w:unhideWhenUsed/>
     <w:qFormat/>
     <w:pPr>
-      <w:spacing w:after="100" w:before="100"/>
-      <w:ind w:firstLine="0" w:left="480" w:right="480"/>
-    </w:pPr>
-  </w:style>
-  <w:style w:default="1" w:styleId="DefaultParagraphFont" w:type="character">
-    <w:name w:val="Default Paragraph Font"/>
+      <w:spacing w:before="100" w:after="100"/>
+      <w:ind w:left="480" w:right="480"/>
+    </w:pPr>
+  </w:style>
+  <w:style w:type="table" w:customStyle="1" w:styleId="Table">
+    <w:name w:val="Table"/>
     <w:semiHidden/>
     <w:unhideWhenUsed/>
-  </w:style>
-  <w:style w:default="1" w:styleId="Table" w:type="table">
-    <w:name w:val="Table"/>
-    <w:basedOn w:val="TableNormal"/>
-    <w:semiHidden/>
-    <w:unhideWhenUsed/>
     <w:qFormat/>
     <w:tblPr>
-      <w:tblInd w:type="dxa" w:w="0"/>
+      <w:tblInd w:w="0" w:type="dxa"/>
       <w:tblCellMar>
-        <w:top w:type="dxa" w:w="0"/>
-        <w:left w:type="dxa" w:w="108"/>
-        <w:bottom w:type="dxa" w:w="0"/>
-        <w:right w:type="dxa" w:w="108"/>
+        <w:top w:w="0" w:type="dxa"/>
+        <w:left w:w="108" w:type="dxa"/>
+        <w:bottom w:w="0" w:type="dxa"/>
+        <w:right w:w="108" w:type="dxa"/>
       </w:tblCellMar>
     </w:tblPr>
     <w:tblStylePr w:type="firstRow">
+      <w:tblPr/>
       <w:tcPr>
         <w:tcBorders>
-          <w:bottom w:val="single"/>
+          <w:bottom w:val="single" w:sz="0" w:space="0" w:color="auto"/>
         </w:tcBorders>
         <w:vAlign w:val="bottom"/>
       </w:tcPr>
     </w:tblStylePr>
   </w:style>
-  <w:style w:customStyle="1" w:styleId="DefinitionTerm" w:type="paragraph">
+  <w:style w:type="paragraph" w:customStyle="1" w:styleId="DefinitionTerm">
     <w:name w:val="Definition Term"/>
-    <w:basedOn w:val="Normal"/>
+    <w:basedOn w:val="a"/>
     <w:next w:val="Definition"/>
     <w:pPr>
       <w:keepNext/>
@@ -1182,78 +1397,79 @@
       <w:b/>
     </w:rPr>
   </w:style>
-  <w:style w:customStyle="1" w:styleId="Definition" w:type="paragraph">
+  <w:style w:type="paragraph" w:customStyle="1" w:styleId="Definition">
     <w:name w:val="Definition"/>
-    <w:basedOn w:val="Normal"/>
-  </w:style>
-  <w:style w:styleId="Caption" w:type="paragraph">
-    <w:name w:val="Caption"/>
-    <w:basedOn w:val="Normal"/>
-    <w:link w:val="BodyTextChar"/>
-    <w:pPr>
-      <w:spacing w:after="120" w:before="0"/>
+    <w:basedOn w:val="a"/>
+  </w:style>
+  <w:style w:type="paragraph" w:styleId="ac">
+    <w:name w:val="caption"/>
+    <w:basedOn w:val="a"/>
+    <w:link w:val="ad"/>
+    <w:pPr>
+      <w:spacing w:after="120"/>
     </w:pPr>
     <w:rPr>
       <w:i/>
     </w:rPr>
   </w:style>
-  <w:style w:customStyle="1" w:styleId="TableCaption" w:type="paragraph">
+  <w:style w:type="paragraph" w:customStyle="1" w:styleId="TableCaption">
     <w:name w:val="Table Caption"/>
-    <w:basedOn w:val="Caption"/>
+    <w:basedOn w:val="ac"/>
     <w:pPr>
       <w:keepNext/>
     </w:pPr>
   </w:style>
-  <w:style w:customStyle="1" w:styleId="ImageCaption" w:type="paragraph">
+  <w:style w:type="paragraph" w:customStyle="1" w:styleId="ImageCaption">
     <w:name w:val="Image Caption"/>
-    <w:basedOn w:val="Caption"/>
-  </w:style>
-  <w:style w:customStyle="1" w:styleId="Figure" w:type="paragraph">
+    <w:basedOn w:val="ac"/>
+  </w:style>
+  <w:style w:type="paragraph" w:customStyle="1" w:styleId="Figure">
     <w:name w:val="Figure"/>
-    <w:basedOn w:val="Normal"/>
-  </w:style>
-  <w:style w:customStyle="1" w:styleId="CaptionedFigure" w:type="paragraph">
+    <w:basedOn w:val="a"/>
+  </w:style>
+  <w:style w:type="paragraph" w:customStyle="1" w:styleId="CaptionedFigure">
     <w:name w:val="Captioned Figure"/>
     <w:basedOn w:val="Figure"/>
     <w:pPr>
       <w:keepNext/>
     </w:pPr>
   </w:style>
-  <w:style w:customStyle="1" w:styleId="BodyTextChar" w:type="character">
-    <w:name w:val="Body Text Char"/>
-    <w:basedOn w:val="DefaultParagraphFont"/>
-    <w:link w:val="BodyText"/>
-  </w:style>
-  <w:style w:customStyle="1" w:styleId="VerbatimChar" w:type="character">
+  <w:style w:type="character" w:customStyle="1" w:styleId="ad">
+    <w:name w:val="図表番号 (文字)"/>
+    <w:basedOn w:val="a1"/>
+    <w:link w:val="ac"/>
+  </w:style>
+  <w:style w:type="character" w:customStyle="1" w:styleId="VerbatimChar">
     <w:name w:val="Verbatim Char"/>
-    <w:basedOn w:val="BodyTextChar"/>
-    <w:rPr>
-      <w:rFonts w:ascii="Consolas" w:hAnsi="Consolas"/>
-      <w:sz w:val="22"/>
-    </w:rPr>
-  </w:style>
-  <w:style w:customStyle="1" w:styleId="SectionNumber" w:type="character">
+    <w:basedOn w:val="ad"/>
+    <w:link w:val="SourceCode"/>
+    <w:rPr>
+      <w:rFonts w:ascii="Consolas" w:hAnsi="Consolas"/>
+      <w:sz w:val="22"/>
+    </w:rPr>
+  </w:style>
+  <w:style w:type="character" w:customStyle="1" w:styleId="SectionNumber">
     <w:name w:val="Section Number"/>
-    <w:basedOn w:val="BodyTextChar"/>
-  </w:style>
-  <w:style w:styleId="FootnoteReference" w:type="character">
-    <w:name w:val="Footnote Reference"/>
-    <w:basedOn w:val="BodyTextChar"/>
+    <w:basedOn w:val="ad"/>
+  </w:style>
+  <w:style w:type="character" w:styleId="ae">
+    <w:name w:val="footnote reference"/>
+    <w:basedOn w:val="ad"/>
     <w:rPr>
       <w:vertAlign w:val="superscript"/>
     </w:rPr>
   </w:style>
-  <w:style w:styleId="Hyperlink" w:type="character">
+  <w:style w:type="character" w:styleId="af">
     <w:name w:val="Hyperlink"/>
-    <w:basedOn w:val="BodyTextChar"/>
-    <w:rPr>
-      <w:color w:themeColor="accent1" w:val="4F81BD"/>
-    </w:rPr>
-  </w:style>
-  <w:style w:styleId="TOCHeading" w:type="paragraph">
+    <w:basedOn w:val="ad"/>
+    <w:rPr>
+      <w:color w:val="156082" w:themeColor="accent1"/>
+    </w:rPr>
+  </w:style>
+  <w:style w:type="paragraph" w:styleId="af0">
     <w:name w:val="TOC Heading"/>
-    <w:basedOn w:val="Heading1"/>
-    <w:next w:val="BodyText"/>
+    <w:basedOn w:val="1"/>
+    <w:next w:val="a0"/>
     <w:uiPriority w:val="39"/>
     <w:unhideWhenUsed/>
     <w:qFormat/>
@@ -1261,246 +1477,305 @@
       <w:spacing w:before="240" w:line="259" w:lineRule="auto"/>
       <w:outlineLvl w:val="9"/>
     </w:pPr>
-    <w:rPr>
-      <w:rFonts w:asciiTheme="majorHAnsi" w:cstheme="majorBidi" w:eastAsiaTheme="majorEastAsia" w:hAnsiTheme="majorHAnsi"/>
-      <w:b w:val="0"/>
-      <w:bCs w:val="0"/>
-      <w:color w:themeColor="accent1" w:themeShade="BF" w:val="365F91"/>
-    </w:rPr>
   </w:style>
   <w:style w:type="paragraph" w:customStyle="1" w:styleId="SourceCode">
     <w:name w:val="Source Code"/>
-    <w:basedOn w:val="Normal"/>
+    <w:basedOn w:val="a"/>
     <w:link w:val="VerbatimChar"/>
     <w:pPr>
-      <w:wordWrap w:val="off"/>
+      <w:wordWrap w:val="0"/>
     </w:pPr>
   </w:style>
   <w:style w:type="character" w:customStyle="1" w:styleId="KeywordTok">
     <w:name w:val="KeywordTok"/>
     <w:basedOn w:val="VerbatimChar"/>
     <w:rPr>
+      <w:rFonts w:ascii="Consolas" w:hAnsi="Consolas"/>
       <w:b/>
       <w:color w:val="007020"/>
+      <w:sz w:val="22"/>
     </w:rPr>
   </w:style>
   <w:style w:type="character" w:customStyle="1" w:styleId="DataTypeTok">
     <w:name w:val="DataTypeTok"/>
     <w:basedOn w:val="VerbatimChar"/>
     <w:rPr>
+      <w:rFonts w:ascii="Consolas" w:hAnsi="Consolas"/>
       <w:color w:val="902000"/>
+      <w:sz w:val="22"/>
     </w:rPr>
   </w:style>
   <w:style w:type="character" w:customStyle="1" w:styleId="DecValTok">
     <w:name w:val="DecValTok"/>
     <w:basedOn w:val="VerbatimChar"/>
     <w:rPr>
-      <w:color w:val="40a070"/>
+      <w:rFonts w:ascii="Consolas" w:hAnsi="Consolas"/>
+      <w:color w:val="40A070"/>
+      <w:sz w:val="22"/>
     </w:rPr>
   </w:style>
   <w:style w:type="character" w:customStyle="1" w:styleId="BaseNTok">
     <w:name w:val="BaseNTok"/>
     <w:basedOn w:val="VerbatimChar"/>
     <w:rPr>
-      <w:color w:val="40a070"/>
+      <w:rFonts w:ascii="Consolas" w:hAnsi="Consolas"/>
+      <w:color w:val="40A070"/>
+      <w:sz w:val="22"/>
     </w:rPr>
   </w:style>
   <w:style w:type="character" w:customStyle="1" w:styleId="FloatTok">
     <w:name w:val="FloatTok"/>
     <w:basedOn w:val="VerbatimChar"/>
     <w:rPr>
-      <w:color w:val="40a070"/>
+      <w:rFonts w:ascii="Consolas" w:hAnsi="Consolas"/>
+      <w:color w:val="40A070"/>
+      <w:sz w:val="22"/>
     </w:rPr>
   </w:style>
   <w:style w:type="character" w:customStyle="1" w:styleId="ConstantTok">
     <w:name w:val="ConstantTok"/>
     <w:basedOn w:val="VerbatimChar"/>
     <w:rPr>
+      <w:rFonts w:ascii="Consolas" w:hAnsi="Consolas"/>
       <w:color w:val="880000"/>
+      <w:sz w:val="22"/>
     </w:rPr>
   </w:style>
   <w:style w:type="character" w:customStyle="1" w:styleId="CharTok">
     <w:name w:val="CharTok"/>
     <w:basedOn w:val="VerbatimChar"/>
     <w:rPr>
-      <w:color w:val="4070a0"/>
+      <w:rFonts w:ascii="Consolas" w:hAnsi="Consolas"/>
+      <w:color w:val="4070A0"/>
+      <w:sz w:val="22"/>
     </w:rPr>
   </w:style>
   <w:style w:type="character" w:customStyle="1" w:styleId="SpecialCharTok">
     <w:name w:val="SpecialCharTok"/>
     <w:basedOn w:val="VerbatimChar"/>
     <w:rPr>
-      <w:color w:val="4070a0"/>
+      <w:rFonts w:ascii="Consolas" w:hAnsi="Consolas"/>
+      <w:color w:val="4070A0"/>
+      <w:sz w:val="22"/>
     </w:rPr>
   </w:style>
   <w:style w:type="character" w:customStyle="1" w:styleId="StringTok">
     <w:name w:val="StringTok"/>
     <w:basedOn w:val="VerbatimChar"/>
     <w:rPr>
-      <w:color w:val="4070a0"/>
+      <w:rFonts w:ascii="Consolas" w:hAnsi="Consolas"/>
+      <w:color w:val="4070A0"/>
+      <w:sz w:val="22"/>
     </w:rPr>
   </w:style>
   <w:style w:type="character" w:customStyle="1" w:styleId="VerbatimStringTok">
     <w:name w:val="VerbatimStringTok"/>
     <w:basedOn w:val="VerbatimChar"/>
     <w:rPr>
-      <w:color w:val="4070a0"/>
+      <w:rFonts w:ascii="Consolas" w:hAnsi="Consolas"/>
+      <w:color w:val="4070A0"/>
+      <w:sz w:val="22"/>
     </w:rPr>
   </w:style>
   <w:style w:type="character" w:customStyle="1" w:styleId="SpecialStringTok">
     <w:name w:val="SpecialStringTok"/>
     <w:basedOn w:val="VerbatimChar"/>
     <w:rPr>
-      <w:color w:val="bb6688"/>
+      <w:rFonts w:ascii="Consolas" w:hAnsi="Consolas"/>
+      <w:color w:val="BB6688"/>
+      <w:sz w:val="22"/>
     </w:rPr>
   </w:style>
   <w:style w:type="character" w:customStyle="1" w:styleId="ImportTok">
     <w:name w:val="ImportTok"/>
     <w:basedOn w:val="VerbatimChar"/>
     <w:rPr>
+      <w:rFonts w:ascii="Consolas" w:hAnsi="Consolas"/>
       <w:b/>
       <w:color w:val="008000"/>
+      <w:sz w:val="22"/>
     </w:rPr>
   </w:style>
   <w:style w:type="character" w:customStyle="1" w:styleId="CommentTok">
     <w:name w:val="CommentTok"/>
     <w:basedOn w:val="VerbatimChar"/>
     <w:rPr>
+      <w:rFonts w:ascii="Consolas" w:hAnsi="Consolas"/>
       <w:i/>
-      <w:color w:val="60a0b0"/>
+      <w:color w:val="60A0B0"/>
+      <w:sz w:val="22"/>
     </w:rPr>
   </w:style>
   <w:style w:type="character" w:customStyle="1" w:styleId="DocumentationTok">
     <w:name w:val="DocumentationTok"/>
     <w:basedOn w:val="VerbatimChar"/>
     <w:rPr>
+      <w:rFonts w:ascii="Consolas" w:hAnsi="Consolas"/>
       <w:i/>
-      <w:color w:val="ba2121"/>
+      <w:color w:val="BA2121"/>
+      <w:sz w:val="22"/>
     </w:rPr>
   </w:style>
   <w:style w:type="character" w:customStyle="1" w:styleId="AnnotationTok">
     <w:name w:val="AnnotationTok"/>
     <w:basedOn w:val="VerbatimChar"/>
     <w:rPr>
+      <w:rFonts w:ascii="Consolas" w:hAnsi="Consolas"/>
       <w:b/>
       <w:i/>
-      <w:color w:val="60a0b0"/>
+      <w:color w:val="60A0B0"/>
+      <w:sz w:val="22"/>
     </w:rPr>
   </w:style>
   <w:style w:type="character" w:customStyle="1" w:styleId="CommentVarTok">
     <w:name w:val="CommentVarTok"/>
     <w:basedOn w:val="VerbatimChar"/>
     <w:rPr>
+      <w:rFonts w:ascii="Consolas" w:hAnsi="Consolas"/>
       <w:b/>
       <w:i/>
-      <w:color w:val="60a0b0"/>
+      <w:color w:val="60A0B0"/>
+      <w:sz w:val="22"/>
     </w:rPr>
   </w:style>
   <w:style w:type="character" w:customStyle="1" w:styleId="OtherTok">
     <w:name w:val="OtherTok"/>
     <w:basedOn w:val="VerbatimChar"/>
     <w:rPr>
+      <w:rFonts w:ascii="Consolas" w:hAnsi="Consolas"/>
       <w:color w:val="007020"/>
+      <w:sz w:val="22"/>
     </w:rPr>
   </w:style>
   <w:style w:type="character" w:customStyle="1" w:styleId="FunctionTok">
     <w:name w:val="FunctionTok"/>
     <w:basedOn w:val="VerbatimChar"/>
     <w:rPr>
-      <w:color w:val="06287e"/>
+      <w:rFonts w:ascii="Consolas" w:hAnsi="Consolas"/>
+      <w:color w:val="06287E"/>
+      <w:sz w:val="22"/>
     </w:rPr>
   </w:style>
   <w:style w:type="character" w:customStyle="1" w:styleId="VariableTok">
     <w:name w:val="VariableTok"/>
     <w:basedOn w:val="VerbatimChar"/>
     <w:rPr>
-      <w:color w:val="19177c"/>
+      <w:rFonts w:ascii="Consolas" w:hAnsi="Consolas"/>
+      <w:color w:val="19177C"/>
+      <w:sz w:val="22"/>
     </w:rPr>
   </w:style>
   <w:style w:type="character" w:customStyle="1" w:styleId="ControlFlowTok">
     <w:name w:val="ControlFlowTok"/>
     <w:basedOn w:val="VerbatimChar"/>
     <w:rPr>
+      <w:rFonts w:ascii="Consolas" w:hAnsi="Consolas"/>
       <w:b/>
       <w:color w:val="007020"/>
+      <w:sz w:val="22"/>
     </w:rPr>
   </w:style>
   <w:style w:type="character" w:customStyle="1" w:styleId="OperatorTok">
     <w:name w:val="OperatorTok"/>
     <w:basedOn w:val="VerbatimChar"/>
     <w:rPr>
+      <w:rFonts w:ascii="Consolas" w:hAnsi="Consolas"/>
       <w:color w:val="666666"/>
+      <w:sz w:val="22"/>
     </w:rPr>
   </w:style>
   <w:style w:type="character" w:customStyle="1" w:styleId="BuiltInTok">
     <w:name w:val="BuiltInTok"/>
     <w:basedOn w:val="VerbatimChar"/>
     <w:rPr>
+      <w:rFonts w:ascii="Consolas" w:hAnsi="Consolas"/>
       <w:color w:val="008000"/>
+      <w:sz w:val="22"/>
     </w:rPr>
   </w:style>
   <w:style w:type="character" w:customStyle="1" w:styleId="ExtensionTok">
     <w:name w:val="ExtensionTok"/>
     <w:basedOn w:val="VerbatimChar"/>
-    <w:rPr/>
+    <w:rPr>
+      <w:rFonts w:ascii="Consolas" w:hAnsi="Consolas"/>
+      <w:sz w:val="22"/>
+    </w:rPr>
   </w:style>
   <w:style w:type="character" w:customStyle="1" w:styleId="PreprocessorTok">
     <w:name w:val="PreprocessorTok"/>
     <w:basedOn w:val="VerbatimChar"/>
     <w:rPr>
-      <w:color w:val="bc7a00"/>
+      <w:rFonts w:ascii="Consolas" w:hAnsi="Consolas"/>
+      <w:color w:val="BC7A00"/>
+      <w:sz w:val="22"/>
     </w:rPr>
   </w:style>
   <w:style w:type="character" w:customStyle="1" w:styleId="AttributeTok">
     <w:name w:val="AttributeTok"/>
     <w:basedOn w:val="VerbatimChar"/>
     <w:rPr>
-      <w:color w:val="7d9029"/>
+      <w:rFonts w:ascii="Consolas" w:hAnsi="Consolas"/>
+      <w:color w:val="7D9029"/>
+      <w:sz w:val="22"/>
     </w:rPr>
   </w:style>
   <w:style w:type="character" w:customStyle="1" w:styleId="RegionMarkerTok">
     <w:name w:val="RegionMarkerTok"/>
     <w:basedOn w:val="VerbatimChar"/>
-    <w:rPr/>
+    <w:rPr>
+      <w:rFonts w:ascii="Consolas" w:hAnsi="Consolas"/>
+      <w:sz w:val="22"/>
+    </w:rPr>
   </w:style>
   <w:style w:type="character" w:customStyle="1" w:styleId="InformationTok">
     <w:name w:val="InformationTok"/>
     <w:basedOn w:val="VerbatimChar"/>
     <w:rPr>
+      <w:rFonts w:ascii="Consolas" w:hAnsi="Consolas"/>
       <w:b/>
       <w:i/>
-      <w:color w:val="60a0b0"/>
+      <w:color w:val="60A0B0"/>
+      <w:sz w:val="22"/>
     </w:rPr>
   </w:style>
   <w:style w:type="character" w:customStyle="1" w:styleId="WarningTok">
     <w:name w:val="WarningTok"/>
     <w:basedOn w:val="VerbatimChar"/>
     <w:rPr>
+      <w:rFonts w:ascii="Consolas" w:hAnsi="Consolas"/>
       <w:b/>
       <w:i/>
-      <w:color w:val="60a0b0"/>
+      <w:color w:val="60A0B0"/>
+      <w:sz w:val="22"/>
     </w:rPr>
   </w:style>
   <w:style w:type="character" w:customStyle="1" w:styleId="AlertTok">
     <w:name w:val="AlertTok"/>
     <w:basedOn w:val="VerbatimChar"/>
     <w:rPr>
+      <w:rFonts w:ascii="Consolas" w:hAnsi="Consolas"/>
       <w:b/>
-      <w:color w:val="ff0000"/>
+      <w:color w:val="FF0000"/>
+      <w:sz w:val="22"/>
     </w:rPr>
   </w:style>
   <w:style w:type="character" w:customStyle="1" w:styleId="ErrorTok">
     <w:name w:val="ErrorTok"/>
     <w:basedOn w:val="VerbatimChar"/>
     <w:rPr>
+      <w:rFonts w:ascii="Consolas" w:hAnsi="Consolas"/>
       <w:b/>
-      <w:color w:val="ff0000"/>
+      <w:color w:val="FF0000"/>
+      <w:sz w:val="22"/>
     </w:rPr>
   </w:style>
   <w:style w:type="character" w:customStyle="1" w:styleId="NormalTok">
     <w:name w:val="NormalTok"/>
     <w:basedOn w:val="VerbatimChar"/>
-    <w:rPr/>
+    <w:rPr>
+      <w:rFonts w:ascii="Consolas" w:hAnsi="Consolas"/>
+      <w:sz w:val="22"/>
+    </w:rPr>
   </w:style>
 </w:styles>
 </file>

</xml_diff>